<commit_message>
Implemented ICP ground-truth preprocessing pipeline and generated master residue-label CSV
- Added gt_preprocess.py to map leaf image filenames to ICP measurements
- Converted ICP-derived copper residue values into mg/cm² labels
- Implemented tertile-based residue binning (low/medium/high)
- Generated master_icp.csv for training-ready image/label mapping
- Added preprocessing and residue-analysis notes/documentation
- Included older weekly report and Roboflow reference notes
</commit_message>
<xml_diff>
--- a/Weekly_Reports/REU_AgAI_DavidOrjuela_WeeklyReport_2026-03-09.docx
+++ b/Weekly_Reports/REU_AgAI_DavidOrjuela_WeeklyReport_2026-03-09.docx
@@ -35,7 +35,6 @@
         </w:rPr>
         <w:br/>
       </w:r>
-      <w:proofErr w:type="spellStart"/>
       <w:r>
         <w:rPr>
           <w:rFonts w:ascii="Times New Roman" w:hAnsi="Times New Roman" w:cs="Times New Roman"/>
@@ -44,9 +43,8 @@
           <w:sz w:val="28"/>
           <w:szCs w:val="28"/>
         </w:rPr>
-        <w:t>AgAI</w:t>
-      </w:r>
-      <w:proofErr w:type="spellEnd"/>
+        <w:t>AgAI Pesticide Residue &amp; Leaf Classification Project</w:t>
+      </w:r>
       <w:r>
         <w:rPr>
           <w:rFonts w:ascii="Times New Roman" w:hAnsi="Times New Roman" w:cs="Times New Roman"/>
@@ -55,9 +53,82 @@
           <w:sz w:val="28"/>
           <w:szCs w:val="28"/>
         </w:rPr>
-        <w:t xml:space="preserve"> Pesticide Residue &amp; Leaf Classification Project</w:t>
-      </w:r>
-      <w:r>
+        <w:br/>
+      </w:r>
+      <w:r>
+        <w:rPr>
+          <w:rFonts w:ascii="Times New Roman" w:hAnsi="Times New Roman" w:cs="Times New Roman"/>
+          <w:i/>
+          <w:iCs/>
+          <w:sz w:val="28"/>
+          <w:szCs w:val="28"/>
+        </w:rPr>
+        <w:t xml:space="preserve">Week </w:t>
+      </w:r>
+      <w:r>
+        <w:rPr>
+          <w:rFonts w:ascii="Times New Roman" w:hAnsi="Times New Roman" w:cs="Times New Roman"/>
+          <w:i/>
+          <w:iCs/>
+          <w:sz w:val="28"/>
+          <w:szCs w:val="28"/>
+        </w:rPr>
+        <w:t>2</w:t>
+      </w:r>
+      <w:r>
+        <w:rPr>
+          <w:rFonts w:ascii="Times New Roman" w:hAnsi="Times New Roman" w:cs="Times New Roman"/>
+          <w:i/>
+          <w:iCs/>
+          <w:sz w:val="28"/>
+          <w:szCs w:val="28"/>
+        </w:rPr>
+        <w:t xml:space="preserve">: </w:t>
+      </w:r>
+      <w:r>
+        <w:rPr>
+          <w:rFonts w:ascii="Times New Roman" w:hAnsi="Times New Roman" w:cs="Times New Roman"/>
+          <w:i/>
+          <w:iCs/>
+          <w:sz w:val="28"/>
+          <w:szCs w:val="28"/>
+        </w:rPr>
+        <w:t>3</w:t>
+      </w:r>
+      <w:r>
+        <w:rPr>
+          <w:rFonts w:ascii="Times New Roman" w:hAnsi="Times New Roman" w:cs="Times New Roman"/>
+          <w:i/>
+          <w:iCs/>
+          <w:sz w:val="28"/>
+          <w:szCs w:val="28"/>
+        </w:rPr>
+        <w:t>/</w:t>
+      </w:r>
+      <w:r>
+        <w:rPr>
+          <w:rFonts w:ascii="Times New Roman" w:hAnsi="Times New Roman" w:cs="Times New Roman"/>
+          <w:i/>
+          <w:iCs/>
+          <w:sz w:val="28"/>
+          <w:szCs w:val="28"/>
+        </w:rPr>
+        <w:t>9</w:t>
+      </w:r>
+      <w:r>
+        <w:rPr>
+          <w:rFonts w:ascii="Times New Roman" w:hAnsi="Times New Roman" w:cs="Times New Roman"/>
+          <w:i/>
+          <w:iCs/>
+          <w:sz w:val="28"/>
+          <w:szCs w:val="28"/>
+        </w:rPr>
+        <w:t>/2026</w:t>
+      </w:r>
+    </w:p>
+    <w:p>
+      <w:pPr>
+        <w:spacing w:after="0"/>
         <w:rPr>
           <w:rFonts w:ascii="Times New Roman" w:hAnsi="Times New Roman" w:cs="Times New Roman"/>
           <w:b/>
@@ -65,115 +136,1552 @@
           <w:sz w:val="28"/>
           <w:szCs w:val="28"/>
         </w:rPr>
-        <w:br/>
-      </w:r>
-      <w:r>
-        <w:rPr>
-          <w:rFonts w:ascii="Times New Roman" w:hAnsi="Times New Roman" w:cs="Times New Roman"/>
-          <w:i/>
-          <w:iCs/>
+      </w:pPr>
+      <w:r>
+        <w:rPr>
+          <w:rFonts w:ascii="Times New Roman" w:hAnsi="Times New Roman" w:cs="Times New Roman"/>
+          <w:b/>
+          <w:bCs/>
           <w:sz w:val="28"/>
           <w:szCs w:val="28"/>
         </w:rPr>
-        <w:t xml:space="preserve">Week </w:t>
-      </w:r>
-      <w:r>
-        <w:rPr>
-          <w:rFonts w:ascii="Times New Roman" w:hAnsi="Times New Roman" w:cs="Times New Roman"/>
-          <w:i/>
-          <w:iCs/>
+        <w:t>Progress This Week</w:t>
+      </w:r>
+    </w:p>
+    <w:p>
+      <w:pPr>
+        <w:pStyle w:val="ListParagraph"/>
+        <w:numPr>
+          <w:ilvl w:val="0"/>
+          <w:numId w:val="27"/>
+        </w:numPr>
+        <w:spacing w:after="0"/>
+        <w:rPr>
+          <w:rFonts w:ascii="Times New Roman" w:hAnsi="Times New Roman" w:cs="Times New Roman"/>
+          <w:b/>
+          <w:bCs/>
+        </w:rPr>
+      </w:pPr>
+      <w:r>
+        <w:rPr>
+          <w:rFonts w:ascii="Times New Roman" w:hAnsi="Times New Roman" w:cs="Times New Roman"/>
+          <w:b/>
+          <w:bCs/>
+        </w:rPr>
+        <w:t>Refined baseline modeling objective</w:t>
+      </w:r>
+    </w:p>
+    <w:p>
+      <w:pPr>
+        <w:spacing w:after="0"/>
+        <w:rPr>
+          <w:rFonts w:ascii="Times New Roman" w:hAnsi="Times New Roman" w:cs="Times New Roman"/>
+        </w:rPr>
+      </w:pPr>
+      <w:r>
+        <w:rPr>
+          <w:rFonts w:ascii="Times New Roman" w:hAnsi="Times New Roman" w:cs="Times New Roman"/>
+        </w:rPr>
+        <w:t>Following Dr. Chen</w:t>
+      </w:r>
+      <w:r>
+        <w:rPr>
+          <w:rFonts w:ascii="Times New Roman" w:hAnsi="Times New Roman" w:cs="Times New Roman"/>
+        </w:rPr>
+        <w:t>’</w:t>
+      </w:r>
+      <w:r>
+        <w:rPr>
+          <w:rFonts w:ascii="Times New Roman" w:hAnsi="Times New Roman" w:cs="Times New Roman"/>
+        </w:rPr>
+        <w:t xml:space="preserve">s suggestion, I redesigned the initial baseline from a </w:t>
+      </w:r>
+      <w:r>
+        <w:rPr>
+          <w:rFonts w:ascii="Times New Roman" w:hAnsi="Times New Roman" w:cs="Times New Roman"/>
+          <w:b/>
+          <w:bCs/>
+        </w:rPr>
+        <w:t>binary pesticide decision model</w:t>
+      </w:r>
+      <w:r>
+        <w:rPr>
+          <w:rFonts w:ascii="Times New Roman" w:hAnsi="Times New Roman" w:cs="Times New Roman"/>
+        </w:rPr>
+        <w:t xml:space="preserve"> to a </w:t>
+      </w:r>
+      <w:r>
+        <w:rPr>
+          <w:rFonts w:ascii="Times New Roman" w:hAnsi="Times New Roman" w:cs="Times New Roman"/>
+          <w:b/>
+          <w:bCs/>
+        </w:rPr>
+        <w:t>multi-class classification model predicting pesticide concentration bins</w:t>
+      </w:r>
+      <w:r>
+        <w:rPr>
+          <w:rFonts w:ascii="Times New Roman" w:hAnsi="Times New Roman" w:cs="Times New Roman"/>
+        </w:rPr>
+        <w:t xml:space="preserve"> </w:t>
+      </w:r>
+      <w:r>
+        <w:rPr>
+          <w:rFonts w:ascii="Times New Roman" w:hAnsi="Times New Roman" w:cs="Times New Roman"/>
+        </w:rPr>
+        <w:t>(exact bins to be finalized with the team)</w:t>
+      </w:r>
+      <w:r>
+        <w:rPr>
+          <w:rFonts w:ascii="Times New Roman" w:hAnsi="Times New Roman" w:cs="Times New Roman"/>
+        </w:rPr>
+        <w:t>.</w:t>
+      </w:r>
+    </w:p>
+    <w:p>
+      <w:pPr>
+        <w:spacing w:after="0"/>
+        <w:rPr>
+          <w:rFonts w:ascii="Times New Roman" w:hAnsi="Times New Roman" w:cs="Times New Roman"/>
+        </w:rPr>
+      </w:pPr>
+    </w:p>
+    <w:p>
+      <w:pPr>
+        <w:spacing w:after="0"/>
+        <w:rPr>
+          <w:rFonts w:ascii="Times New Roman" w:hAnsi="Times New Roman" w:cs="Times New Roman"/>
+        </w:rPr>
+      </w:pPr>
+      <w:r>
+        <w:rPr>
+          <w:rFonts w:ascii="Times New Roman" w:hAnsi="Times New Roman" w:cs="Times New Roman"/>
+        </w:rPr>
+        <w:t>The updated baseline objective is:</w:t>
+      </w:r>
+    </w:p>
+    <w:p>
+      <w:pPr>
+        <w:pStyle w:val="ListParagraph"/>
+        <w:numPr>
+          <w:ilvl w:val="0"/>
+          <w:numId w:val="26"/>
+        </w:numPr>
+        <w:spacing w:after="0"/>
+        <w:rPr>
+          <w:rFonts w:ascii="Times New Roman" w:hAnsi="Times New Roman" w:cs="Times New Roman"/>
+        </w:rPr>
+      </w:pPr>
+      <w:r>
+        <w:rPr>
+          <w:rFonts w:ascii="Times New Roman" w:hAnsi="Times New Roman" w:cs="Times New Roman"/>
+        </w:rPr>
+        <w:t xml:space="preserve">Model: CNN </w:t>
+      </w:r>
+      <w:r>
+        <w:rPr>
+          <w:rFonts w:ascii="Times New Roman" w:hAnsi="Times New Roman" w:cs="Times New Roman"/>
+        </w:rPr>
+        <w:t>→</w:t>
+      </w:r>
+      <w:r>
+        <w:rPr>
+          <w:rFonts w:ascii="Times New Roman" w:hAnsi="Times New Roman" w:cs="Times New Roman"/>
+        </w:rPr>
+        <w:t xml:space="preserve"> MLP </w:t>
+      </w:r>
+      <w:r>
+        <w:rPr>
+          <w:rFonts w:ascii="Times New Roman" w:hAnsi="Times New Roman" w:cs="Times New Roman"/>
+        </w:rPr>
+        <w:t>→</w:t>
+      </w:r>
+      <w:r>
+        <w:rPr>
+          <w:rFonts w:ascii="Times New Roman" w:hAnsi="Times New Roman" w:cs="Times New Roman"/>
+        </w:rPr>
+        <w:t xml:space="preserve"> multiclass output</w:t>
+      </w:r>
+    </w:p>
+    <w:p>
+      <w:pPr>
+        <w:pStyle w:val="ListParagraph"/>
+        <w:numPr>
+          <w:ilvl w:val="0"/>
+          <w:numId w:val="26"/>
+        </w:numPr>
+        <w:spacing w:after="0"/>
+        <w:rPr>
+          <w:rFonts w:ascii="Times New Roman" w:hAnsi="Times New Roman" w:cs="Times New Roman"/>
+        </w:rPr>
+      </w:pPr>
+      <w:r>
+        <w:rPr>
+          <w:rFonts w:ascii="Times New Roman" w:hAnsi="Times New Roman" w:cs="Times New Roman"/>
+        </w:rPr>
+        <w:t>Loss: CrossEntropyLoss</w:t>
+      </w:r>
+    </w:p>
+    <w:p>
+      <w:pPr>
+        <w:pStyle w:val="ListParagraph"/>
+        <w:numPr>
+          <w:ilvl w:val="0"/>
+          <w:numId w:val="26"/>
+        </w:numPr>
+        <w:spacing w:after="0"/>
+        <w:rPr>
+          <w:rFonts w:ascii="Times New Roman" w:hAnsi="Times New Roman" w:cs="Times New Roman"/>
+        </w:rPr>
+      </w:pPr>
+      <w:r>
+        <w:rPr>
+          <w:rFonts w:ascii="Times New Roman" w:hAnsi="Times New Roman" w:cs="Times New Roman"/>
+        </w:rPr>
+        <w:t>Goal: predict which pesticide concentration bin a leaf image belongs to.</w:t>
+      </w:r>
+    </w:p>
+    <w:p>
+      <w:pPr>
+        <w:spacing w:after="0"/>
+        <w:rPr>
+          <w:rFonts w:ascii="Times New Roman" w:hAnsi="Times New Roman" w:cs="Times New Roman"/>
+        </w:rPr>
+      </w:pPr>
+    </w:p>
+    <w:p>
+      <w:pPr>
+        <w:spacing w:after="0"/>
+        <w:rPr>
+          <w:rFonts w:ascii="Times New Roman" w:hAnsi="Times New Roman" w:cs="Times New Roman"/>
+        </w:rPr>
+      </w:pPr>
+      <w:r>
+        <w:rPr>
+          <w:rFonts w:ascii="Times New Roman" w:hAnsi="Times New Roman" w:cs="Times New Roman"/>
+        </w:rPr>
+        <w:t>This c</w:t>
+      </w:r>
+      <w:r>
+        <w:rPr>
+          <w:rFonts w:ascii="Times New Roman" w:hAnsi="Times New Roman" w:cs="Times New Roman"/>
+        </w:rPr>
+        <w:t>h</w:t>
+      </w:r>
+      <w:r>
+        <w:rPr>
+          <w:rFonts w:ascii="Times New Roman" w:hAnsi="Times New Roman" w:cs="Times New Roman"/>
+        </w:rPr>
+        <w:t>ange allows the model to capture more granular pesticide level differences rather than a simple threshold decision.</w:t>
+      </w:r>
+    </w:p>
+    <w:p>
+      <w:pPr>
+        <w:spacing w:after="0"/>
+        <w:rPr>
+          <w:rFonts w:ascii="Times New Roman" w:hAnsi="Times New Roman" w:cs="Times New Roman"/>
+          <w:b/>
+          <w:bCs/>
+        </w:rPr>
+      </w:pPr>
+    </w:p>
+    <w:p>
+      <w:pPr>
+        <w:pStyle w:val="ListParagraph"/>
+        <w:numPr>
+          <w:ilvl w:val="0"/>
+          <w:numId w:val="27"/>
+        </w:numPr>
+        <w:spacing w:after="0"/>
+        <w:rPr>
+          <w:rFonts w:ascii="Times New Roman" w:hAnsi="Times New Roman" w:cs="Times New Roman"/>
+          <w:b/>
+          <w:bCs/>
+        </w:rPr>
+      </w:pPr>
+      <w:r>
+        <w:rPr>
+          <w:rFonts w:ascii="Times New Roman" w:hAnsi="Times New Roman" w:cs="Times New Roman"/>
+          <w:b/>
+          <w:bCs/>
+        </w:rPr>
+        <w:t xml:space="preserve"> Began implementing baseline training pipeline</w:t>
+      </w:r>
+    </w:p>
+    <w:p>
+      <w:pPr>
+        <w:spacing w:after="0"/>
+        <w:rPr>
+          <w:rFonts w:ascii="Times New Roman" w:hAnsi="Times New Roman" w:cs="Times New Roman"/>
+          <w:b/>
+          <w:bCs/>
+        </w:rPr>
+      </w:pPr>
+      <w:r>
+        <w:rPr>
+          <w:rFonts w:ascii="Times New Roman" w:hAnsi="Times New Roman" w:cs="Times New Roman"/>
+        </w:rPr>
+        <w:t>I started building the full training pipeline, including:</w:t>
+      </w:r>
+    </w:p>
+    <w:p>
+      <w:pPr>
+        <w:numPr>
+          <w:ilvl w:val="0"/>
+          <w:numId w:val="19"/>
+        </w:numPr>
+        <w:tabs>
+          <w:tab w:val="num" w:pos="360"/>
+        </w:tabs>
+        <w:spacing w:after="0"/>
+        <w:ind w:left="720"/>
+        <w:rPr>
+          <w:rFonts w:ascii="Times New Roman" w:hAnsi="Times New Roman" w:cs="Times New Roman"/>
+        </w:rPr>
+      </w:pPr>
+      <w:r>
+        <w:rPr>
+          <w:rFonts w:ascii="Times New Roman" w:hAnsi="Times New Roman" w:cs="Times New Roman"/>
+        </w:rPr>
+        <w:t>Image preprocessing and dataloader</w:t>
+      </w:r>
+    </w:p>
+    <w:p>
+      <w:pPr>
+        <w:numPr>
+          <w:ilvl w:val="0"/>
+          <w:numId w:val="19"/>
+        </w:numPr>
+        <w:tabs>
+          <w:tab w:val="num" w:pos="360"/>
+        </w:tabs>
+        <w:spacing w:after="0"/>
+        <w:ind w:left="720"/>
+        <w:rPr>
+          <w:rFonts w:ascii="Times New Roman" w:hAnsi="Times New Roman" w:cs="Times New Roman"/>
+        </w:rPr>
+      </w:pPr>
+      <w:r>
+        <w:rPr>
+          <w:rFonts w:ascii="Times New Roman" w:hAnsi="Times New Roman" w:cs="Times New Roman"/>
+        </w:rPr>
+        <w:t>Image resizing and normalization</w:t>
+      </w:r>
+    </w:p>
+    <w:p>
+      <w:pPr>
+        <w:numPr>
+          <w:ilvl w:val="0"/>
+          <w:numId w:val="19"/>
+        </w:numPr>
+        <w:tabs>
+          <w:tab w:val="num" w:pos="360"/>
+        </w:tabs>
+        <w:spacing w:after="0"/>
+        <w:ind w:left="720"/>
+        <w:rPr>
+          <w:rFonts w:ascii="Times New Roman" w:hAnsi="Times New Roman" w:cs="Times New Roman"/>
+        </w:rPr>
+      </w:pPr>
+      <w:r>
+        <w:rPr>
+          <w:rFonts w:ascii="Times New Roman" w:hAnsi="Times New Roman" w:cs="Times New Roman"/>
+        </w:rPr>
+        <w:t>Label mapping system for configurable pesticide bins</w:t>
+      </w:r>
+    </w:p>
+    <w:p>
+      <w:pPr>
+        <w:numPr>
+          <w:ilvl w:val="0"/>
+          <w:numId w:val="19"/>
+        </w:numPr>
+        <w:tabs>
+          <w:tab w:val="num" w:pos="360"/>
+        </w:tabs>
+        <w:spacing w:after="0"/>
+        <w:ind w:left="720"/>
+        <w:rPr>
+          <w:rFonts w:ascii="Times New Roman" w:hAnsi="Times New Roman" w:cs="Times New Roman"/>
+        </w:rPr>
+      </w:pPr>
+      <w:r>
+        <w:rPr>
+          <w:rFonts w:ascii="Times New Roman" w:hAnsi="Times New Roman" w:cs="Times New Roman"/>
+        </w:rPr>
+        <w:t>Small CNN baseline architecture (currently 4 convolutional blocks)</w:t>
+      </w:r>
+    </w:p>
+    <w:p>
+      <w:pPr>
+        <w:numPr>
+          <w:ilvl w:val="0"/>
+          <w:numId w:val="19"/>
+        </w:numPr>
+        <w:tabs>
+          <w:tab w:val="num" w:pos="360"/>
+        </w:tabs>
+        <w:spacing w:after="0"/>
+        <w:ind w:left="720"/>
+        <w:rPr>
+          <w:rFonts w:ascii="Times New Roman" w:hAnsi="Times New Roman" w:cs="Times New Roman"/>
+        </w:rPr>
+      </w:pPr>
+      <w:r>
+        <w:rPr>
+          <w:rFonts w:ascii="Times New Roman" w:hAnsi="Times New Roman" w:cs="Times New Roman"/>
+        </w:rPr>
+        <w:t>Final linear layer with configurable number of classes</w:t>
+      </w:r>
+    </w:p>
+    <w:p>
+      <w:pPr>
+        <w:numPr>
+          <w:ilvl w:val="0"/>
+          <w:numId w:val="19"/>
+        </w:numPr>
+        <w:tabs>
+          <w:tab w:val="num" w:pos="360"/>
+        </w:tabs>
+        <w:spacing w:after="0"/>
+        <w:ind w:left="720"/>
+        <w:rPr>
+          <w:rFonts w:ascii="Times New Roman" w:hAnsi="Times New Roman" w:cs="Times New Roman"/>
+        </w:rPr>
+      </w:pPr>
+      <w:r>
+        <w:rPr>
+          <w:rFonts w:ascii="Times New Roman" w:hAnsi="Times New Roman" w:cs="Times New Roman"/>
+        </w:rPr>
+        <w:t>Training loop using CrossEntropyLoss</w:t>
+      </w:r>
+    </w:p>
+    <w:p>
+      <w:pPr>
+        <w:numPr>
+          <w:ilvl w:val="0"/>
+          <w:numId w:val="19"/>
+        </w:numPr>
+        <w:tabs>
+          <w:tab w:val="num" w:pos="360"/>
+        </w:tabs>
+        <w:spacing w:after="0"/>
+        <w:ind w:left="720"/>
+        <w:rPr>
+          <w:rFonts w:ascii="Times New Roman" w:hAnsi="Times New Roman" w:cs="Times New Roman"/>
+        </w:rPr>
+      </w:pPr>
+      <w:r>
+        <w:rPr>
+          <w:rFonts w:ascii="Times New Roman" w:hAnsi="Times New Roman" w:cs="Times New Roman"/>
+        </w:rPr>
+        <w:t>Evaluation metrics including confusion matrix and per-class accuracy</w:t>
+      </w:r>
+    </w:p>
+    <w:p>
+      <w:pPr>
+        <w:spacing w:after="0"/>
+        <w:rPr>
+          <w:rFonts w:ascii="Times New Roman" w:hAnsi="Times New Roman" w:cs="Times New Roman"/>
+        </w:rPr>
+      </w:pPr>
+    </w:p>
+    <w:p>
+      <w:pPr>
+        <w:spacing w:after="0"/>
+        <w:rPr>
+          <w:rFonts w:ascii="Times New Roman" w:hAnsi="Times New Roman" w:cs="Times New Roman"/>
+        </w:rPr>
+      </w:pPr>
+      <w:r>
+        <w:rPr>
+          <w:rFonts w:ascii="Times New Roman" w:hAnsi="Times New Roman" w:cs="Times New Roman"/>
+        </w:rPr>
+        <w:t>This baseline CNN is intentionally shallow to determine whether the dataset contains usable predictive signal before exploring more complex architectures or pretrained backbones.</w:t>
+      </w:r>
+    </w:p>
+    <w:p>
+      <w:pPr>
+        <w:spacing w:after="0"/>
+        <w:rPr>
+          <w:rFonts w:ascii="Times New Roman" w:hAnsi="Times New Roman" w:cs="Times New Roman"/>
+          <w:b/>
+          <w:bCs/>
+        </w:rPr>
+      </w:pPr>
+    </w:p>
+    <w:p>
+      <w:pPr>
+        <w:pStyle w:val="ListParagraph"/>
+        <w:numPr>
+          <w:ilvl w:val="0"/>
+          <w:numId w:val="27"/>
+        </w:numPr>
+        <w:spacing w:after="0"/>
+        <w:rPr>
+          <w:rFonts w:ascii="Times New Roman" w:hAnsi="Times New Roman" w:cs="Times New Roman"/>
+          <w:b/>
+          <w:bCs/>
+        </w:rPr>
+      </w:pPr>
+      <w:r>
+        <w:rPr>
+          <w:rFonts w:ascii="Times New Roman" w:hAnsi="Times New Roman" w:cs="Times New Roman"/>
+          <w:b/>
+          <w:bCs/>
+        </w:rPr>
+        <w:t>Reviewed William</w:t>
+      </w:r>
+      <w:r>
+        <w:rPr>
+          <w:rFonts w:ascii="Times New Roman" w:hAnsi="Times New Roman" w:cs="Times New Roman"/>
+          <w:b/>
+          <w:bCs/>
+        </w:rPr>
+        <w:t>’</w:t>
+      </w:r>
+      <w:r>
+        <w:rPr>
+          <w:rFonts w:ascii="Times New Roman" w:hAnsi="Times New Roman" w:cs="Times New Roman"/>
+          <w:b/>
+          <w:bCs/>
+        </w:rPr>
+        <w:t>s previous pipeline and detection model</w:t>
+      </w:r>
+    </w:p>
+    <w:p>
+      <w:pPr>
+        <w:spacing w:after="0"/>
+        <w:rPr>
+          <w:rFonts w:ascii="Times New Roman" w:hAnsi="Times New Roman" w:cs="Times New Roman"/>
+        </w:rPr>
+      </w:pPr>
+      <w:r>
+        <w:rPr>
+          <w:rFonts w:ascii="Times New Roman" w:hAnsi="Times New Roman" w:cs="Times New Roman"/>
+        </w:rPr>
+        <w:t>I received William</w:t>
+      </w:r>
+      <w:r>
+        <w:rPr>
+          <w:rFonts w:ascii="Times New Roman" w:hAnsi="Times New Roman" w:cs="Times New Roman"/>
+        </w:rPr>
+        <w:t>’</w:t>
+      </w:r>
+      <w:r>
+        <w:rPr>
+          <w:rFonts w:ascii="Times New Roman" w:hAnsi="Times New Roman" w:cs="Times New Roman"/>
+        </w:rPr>
+        <w:t>s repository and model weights from last year</w:t>
+      </w:r>
+      <w:r>
+        <w:rPr>
+          <w:rFonts w:ascii="Times New Roman" w:hAnsi="Times New Roman" w:cs="Times New Roman"/>
+        </w:rPr>
+        <w:t>’</w:t>
+      </w:r>
+      <w:r>
+        <w:rPr>
+          <w:rFonts w:ascii="Times New Roman" w:hAnsi="Times New Roman" w:cs="Times New Roman"/>
+        </w:rPr>
+        <w:t>s project and began reviewing the architecture and preprocessing approach.</w:t>
+      </w:r>
+    </w:p>
+    <w:p>
+      <w:pPr>
+        <w:spacing w:after="0"/>
+        <w:rPr>
+          <w:rFonts w:ascii="Times New Roman" w:hAnsi="Times New Roman" w:cs="Times New Roman"/>
+        </w:rPr>
+      </w:pPr>
+    </w:p>
+    <w:p>
+      <w:pPr>
+        <w:spacing w:after="0"/>
+        <w:rPr>
+          <w:rFonts w:ascii="Times New Roman" w:hAnsi="Times New Roman" w:cs="Times New Roman"/>
+        </w:rPr>
+      </w:pPr>
+      <w:r>
+        <w:rPr>
+          <w:rFonts w:ascii="Times New Roman" w:hAnsi="Times New Roman" w:cs="Times New Roman"/>
+        </w:rPr>
+        <w:t xml:space="preserve">One important component is his </w:t>
+      </w:r>
+      <w:r>
+        <w:rPr>
+          <w:rFonts w:ascii="Times New Roman" w:hAnsi="Times New Roman" w:cs="Times New Roman"/>
+          <w:b/>
+          <w:bCs/>
+        </w:rPr>
+        <w:t>RF-DETR model fine-tuned for leaf detection</w:t>
+      </w:r>
+      <w:r>
+        <w:rPr>
+          <w:rFonts w:ascii="Times New Roman" w:hAnsi="Times New Roman" w:cs="Times New Roman"/>
+        </w:rPr>
+        <w:t>.</w:t>
+      </w:r>
+    </w:p>
+    <w:p>
+      <w:pPr>
+        <w:spacing w:after="0"/>
+        <w:rPr>
+          <w:rFonts w:ascii="Times New Roman" w:hAnsi="Times New Roman" w:cs="Times New Roman"/>
+        </w:rPr>
+      </w:pPr>
+    </w:p>
+    <w:p>
+      <w:pPr>
+        <w:spacing w:after="0"/>
+        <w:rPr>
+          <w:rFonts w:ascii="Times New Roman" w:hAnsi="Times New Roman" w:cs="Times New Roman"/>
+        </w:rPr>
+      </w:pPr>
+      <w:r>
+        <w:rPr>
+          <w:rFonts w:ascii="Times New Roman" w:hAnsi="Times New Roman" w:cs="Times New Roman"/>
+        </w:rPr>
+        <w:t>Because the RF-DETR detector was trained on visually similar leaf images, it is a reasonable starting point for isolating the primary leaf in each image before classification.</w:t>
+      </w:r>
+    </w:p>
+    <w:p>
+      <w:pPr>
+        <w:spacing w:after="0"/>
+        <w:rPr>
+          <w:rFonts w:ascii="Times New Roman" w:hAnsi="Times New Roman" w:cs="Times New Roman"/>
+        </w:rPr>
+      </w:pPr>
+      <w:r>
+        <w:rPr>
+          <w:rFonts w:ascii="Times New Roman" w:hAnsi="Times New Roman" w:cs="Times New Roman"/>
+        </w:rPr>
+        <w:lastRenderedPageBreak/>
+        <w:t>T</w:t>
+      </w:r>
+      <w:r>
+        <w:rPr>
+          <w:rFonts w:ascii="Times New Roman" w:hAnsi="Times New Roman" w:cs="Times New Roman"/>
+        </w:rPr>
+        <w:t>he planned evaluation process is:</w:t>
+      </w:r>
+    </w:p>
+    <w:p>
+      <w:pPr>
+        <w:spacing w:after="0"/>
+        <w:rPr>
+          <w:rFonts w:ascii="Times New Roman" w:hAnsi="Times New Roman" w:cs="Times New Roman"/>
+        </w:rPr>
+      </w:pPr>
+    </w:p>
+    <w:p>
+      <w:pPr>
+        <w:spacing w:after="0"/>
+        <w:rPr>
+          <w:rFonts w:ascii="Times New Roman" w:hAnsi="Times New Roman" w:cs="Times New Roman"/>
+        </w:rPr>
+      </w:pPr>
+      <w:r>
+        <w:rPr>
+          <w:rFonts w:ascii="Times New Roman" w:hAnsi="Times New Roman" w:cs="Times New Roman"/>
+        </w:rPr>
+        <w:t>Phase 1:</w:t>
+      </w:r>
+    </w:p>
+    <w:p>
+      <w:pPr>
+        <w:numPr>
+          <w:ilvl w:val="0"/>
+          <w:numId w:val="20"/>
+        </w:numPr>
+        <w:spacing w:after="0"/>
+        <w:rPr>
+          <w:rFonts w:ascii="Times New Roman" w:hAnsi="Times New Roman" w:cs="Times New Roman"/>
+        </w:rPr>
+      </w:pPr>
+      <w:r>
+        <w:rPr>
+          <w:rFonts w:ascii="Times New Roman" w:hAnsi="Times New Roman" w:cs="Times New Roman"/>
+        </w:rPr>
+        <w:t>Run RF-DETR using William</w:t>
+      </w:r>
+      <w:r>
+        <w:rPr>
+          <w:rFonts w:ascii="Times New Roman" w:hAnsi="Times New Roman" w:cs="Times New Roman"/>
+        </w:rPr>
+        <w:t>’</w:t>
+      </w:r>
+      <w:r>
+        <w:rPr>
+          <w:rFonts w:ascii="Times New Roman" w:hAnsi="Times New Roman" w:cs="Times New Roman"/>
+        </w:rPr>
+        <w:t>s pretrained weights</w:t>
+      </w:r>
+    </w:p>
+    <w:p>
+      <w:pPr>
+        <w:numPr>
+          <w:ilvl w:val="0"/>
+          <w:numId w:val="20"/>
+        </w:numPr>
+        <w:spacing w:after="0"/>
+        <w:rPr>
+          <w:rFonts w:ascii="Times New Roman" w:hAnsi="Times New Roman" w:cs="Times New Roman"/>
+        </w:rPr>
+      </w:pPr>
+      <w:r>
+        <w:rPr>
+          <w:rFonts w:ascii="Times New Roman" w:hAnsi="Times New Roman" w:cs="Times New Roman"/>
+        </w:rPr>
+        <w:t>Evaluate qualitatively on a subset of the pesticide dataset</w:t>
+      </w:r>
+    </w:p>
+    <w:p>
+      <w:pPr>
+        <w:spacing w:after="0"/>
+        <w:rPr>
+          <w:rFonts w:ascii="Times New Roman" w:hAnsi="Times New Roman" w:cs="Times New Roman"/>
+        </w:rPr>
+      </w:pPr>
+    </w:p>
+    <w:p>
+      <w:pPr>
+        <w:spacing w:after="0"/>
+        <w:rPr>
+          <w:rFonts w:ascii="Times New Roman" w:hAnsi="Times New Roman" w:cs="Times New Roman"/>
+        </w:rPr>
+      </w:pPr>
+      <w:r>
+        <w:rPr>
+          <w:rFonts w:ascii="Times New Roman" w:hAnsi="Times New Roman" w:cs="Times New Roman"/>
+        </w:rPr>
+        <w:t>Key evaluation criteria:</w:t>
+      </w:r>
+    </w:p>
+    <w:p>
+      <w:pPr>
+        <w:numPr>
+          <w:ilvl w:val="0"/>
+          <w:numId w:val="21"/>
+        </w:numPr>
+        <w:spacing w:after="0"/>
+        <w:rPr>
+          <w:rFonts w:ascii="Times New Roman" w:hAnsi="Times New Roman" w:cs="Times New Roman"/>
+        </w:rPr>
+      </w:pPr>
+      <w:r>
+        <w:rPr>
+          <w:rFonts w:ascii="Times New Roman" w:hAnsi="Times New Roman" w:cs="Times New Roman"/>
+        </w:rPr>
+        <w:t>Does it consistently detect the primary leaf?</w:t>
+      </w:r>
+    </w:p>
+    <w:p>
+      <w:pPr>
+        <w:numPr>
+          <w:ilvl w:val="0"/>
+          <w:numId w:val="21"/>
+        </w:numPr>
+        <w:spacing w:after="0"/>
+        <w:rPr>
+          <w:rFonts w:ascii="Times New Roman" w:hAnsi="Times New Roman" w:cs="Times New Roman"/>
+        </w:rPr>
+      </w:pPr>
+      <w:r>
+        <w:rPr>
+          <w:rFonts w:ascii="Times New Roman" w:hAnsi="Times New Roman" w:cs="Times New Roman"/>
+        </w:rPr>
+        <w:t>Does it correctly select the main leaf when multiple leaves are present?</w:t>
+      </w:r>
+    </w:p>
+    <w:p>
+      <w:pPr>
+        <w:numPr>
+          <w:ilvl w:val="0"/>
+          <w:numId w:val="21"/>
+        </w:numPr>
+        <w:spacing w:after="0"/>
+        <w:rPr>
+          <w:rFonts w:ascii="Times New Roman" w:hAnsi="Times New Roman" w:cs="Times New Roman"/>
+        </w:rPr>
+      </w:pPr>
+      <w:r>
+        <w:rPr>
+          <w:rFonts w:ascii="Times New Roman" w:hAnsi="Times New Roman" w:cs="Times New Roman"/>
+        </w:rPr>
+        <w:t>Are bounding boxes tight enough for cropping?</w:t>
+      </w:r>
+    </w:p>
+    <w:p>
+      <w:pPr>
+        <w:numPr>
+          <w:ilvl w:val="0"/>
+          <w:numId w:val="21"/>
+        </w:numPr>
+        <w:spacing w:after="0"/>
+        <w:rPr>
+          <w:rFonts w:ascii="Times New Roman" w:hAnsi="Times New Roman" w:cs="Times New Roman"/>
+        </w:rPr>
+      </w:pPr>
+      <w:r>
+        <w:rPr>
+          <w:rFonts w:ascii="Times New Roman" w:hAnsi="Times New Roman" w:cs="Times New Roman"/>
+        </w:rPr>
+        <w:t>Does performance degrade on leaves with visible pesticide residue?</w:t>
+      </w:r>
+    </w:p>
+    <w:p>
+      <w:pPr>
+        <w:spacing w:after="0"/>
+        <w:rPr>
+          <w:rFonts w:ascii="Times New Roman" w:hAnsi="Times New Roman" w:cs="Times New Roman"/>
+        </w:rPr>
+      </w:pPr>
+    </w:p>
+    <w:p>
+      <w:pPr>
+        <w:spacing w:after="0"/>
+        <w:rPr>
+          <w:rFonts w:ascii="Times New Roman" w:hAnsi="Times New Roman" w:cs="Times New Roman"/>
+        </w:rPr>
+      </w:pPr>
+      <w:r>
+        <w:rPr>
+          <w:rFonts w:ascii="Times New Roman" w:hAnsi="Times New Roman" w:cs="Times New Roman"/>
+        </w:rPr>
+        <w:t>If performance is satisfactory, the pipeline will proceed with:</w:t>
+      </w:r>
+    </w:p>
+    <w:p>
+      <w:pPr>
+        <w:spacing w:after="0"/>
+        <w:rPr>
+          <w:rFonts w:ascii="Times New Roman" w:hAnsi="Times New Roman" w:cs="Times New Roman"/>
+        </w:rPr>
+      </w:pPr>
+      <w:r>
+        <w:rPr>
+          <w:rFonts w:ascii="Times New Roman" w:hAnsi="Times New Roman" w:cs="Times New Roman"/>
+        </w:rPr>
+        <w:t xml:space="preserve">leaf detection </w:t>
+      </w:r>
+      <w:r>
+        <w:rPr>
+          <w:rFonts w:ascii="Times New Roman" w:hAnsi="Times New Roman" w:cs="Times New Roman"/>
+        </w:rPr>
+        <w:t xml:space="preserve">→ </w:t>
+      </w:r>
+      <w:r>
+        <w:rPr>
+          <w:rFonts w:ascii="Times New Roman" w:hAnsi="Times New Roman" w:cs="Times New Roman"/>
+        </w:rPr>
+        <w:t xml:space="preserve">crop </w:t>
+      </w:r>
+      <w:r>
+        <w:rPr>
+          <w:rFonts w:ascii="Times New Roman" w:hAnsi="Times New Roman" w:cs="Times New Roman"/>
+        </w:rPr>
+        <w:t>→</w:t>
+      </w:r>
+      <w:r>
+        <w:rPr>
+          <w:rFonts w:ascii="Times New Roman" w:hAnsi="Times New Roman" w:cs="Times New Roman"/>
+        </w:rPr>
+        <w:t xml:space="preserve"> </w:t>
+      </w:r>
+      <w:r>
+        <w:rPr>
+          <w:rFonts w:ascii="Times New Roman" w:hAnsi="Times New Roman" w:cs="Times New Roman"/>
+        </w:rPr>
+        <w:t xml:space="preserve">resize </w:t>
+      </w:r>
+      <w:r>
+        <w:rPr>
+          <w:rFonts w:ascii="Times New Roman" w:hAnsi="Times New Roman" w:cs="Times New Roman"/>
+        </w:rPr>
+        <w:t>→</w:t>
+      </w:r>
+      <w:r>
+        <w:rPr>
+          <w:rFonts w:ascii="Times New Roman" w:hAnsi="Times New Roman" w:cs="Times New Roman"/>
+        </w:rPr>
+        <w:t xml:space="preserve"> classification</w:t>
+      </w:r>
+    </w:p>
+    <w:p>
+      <w:pPr>
+        <w:spacing w:after="0"/>
+        <w:rPr>
+          <w:rFonts w:ascii="Times New Roman" w:hAnsi="Times New Roman" w:cs="Times New Roman"/>
+        </w:rPr>
+      </w:pPr>
+    </w:p>
+    <w:p>
+      <w:pPr>
+        <w:spacing w:after="0"/>
+        <w:rPr>
+          <w:rFonts w:ascii="Times New Roman" w:hAnsi="Times New Roman" w:cs="Times New Roman"/>
+        </w:rPr>
+      </w:pPr>
+      <w:r>
+        <w:rPr>
+          <w:rFonts w:ascii="Times New Roman" w:hAnsi="Times New Roman" w:cs="Times New Roman"/>
+        </w:rPr>
+        <w:t>If detection performance is insufficient, I will fine-tune a task-specific detector (likely YOLO) on our dataset.</w:t>
+      </w:r>
+    </w:p>
+    <w:p>
+      <w:pPr>
+        <w:spacing w:after="0"/>
+        <w:rPr>
+          <w:rFonts w:ascii="Times New Roman" w:hAnsi="Times New Roman" w:cs="Times New Roman"/>
+        </w:rPr>
+      </w:pPr>
+    </w:p>
+    <w:p>
+      <w:pPr>
+        <w:pStyle w:val="ListParagraph"/>
+        <w:numPr>
+          <w:ilvl w:val="0"/>
+          <w:numId w:val="27"/>
+        </w:numPr>
+        <w:spacing w:after="0"/>
+        <w:rPr>
+          <w:rFonts w:ascii="Times New Roman" w:hAnsi="Times New Roman" w:cs="Times New Roman"/>
+          <w:b/>
+          <w:bCs/>
+        </w:rPr>
+      </w:pPr>
+      <w:r>
+        <w:rPr>
+          <w:rFonts w:ascii="Times New Roman" w:hAnsi="Times New Roman" w:cs="Times New Roman"/>
+          <w:b/>
+          <w:bCs/>
+        </w:rPr>
+        <w:t>Dataset inspection and preliminary preprocessing</w:t>
+      </w:r>
+    </w:p>
+    <w:p>
+      <w:pPr>
+        <w:spacing w:after="0"/>
+        <w:rPr>
+          <w:rFonts w:ascii="Times New Roman" w:hAnsi="Times New Roman" w:cs="Times New Roman"/>
+        </w:rPr>
+      </w:pPr>
+      <w:r>
+        <w:rPr>
+          <w:rFonts w:ascii="Times New Roman" w:hAnsi="Times New Roman" w:cs="Times New Roman"/>
+        </w:rPr>
+        <w:t>While waiting for access to the Roboflow annotations, I located last year</w:t>
+      </w:r>
+      <w:r>
+        <w:rPr>
+          <w:rFonts w:ascii="Times New Roman" w:hAnsi="Times New Roman" w:cs="Times New Roman"/>
+        </w:rPr>
+        <w:t>’</w:t>
+      </w:r>
+      <w:r>
+        <w:rPr>
+          <w:rFonts w:ascii="Times New Roman" w:hAnsi="Times New Roman" w:cs="Times New Roman"/>
+        </w:rPr>
+        <w:t>s pesticide dataset (~580 images across 400, 600, 800, and 1000 ppm classes).</w:t>
+      </w:r>
+    </w:p>
+    <w:p>
+      <w:pPr>
+        <w:spacing w:after="0"/>
+        <w:rPr>
+          <w:rFonts w:ascii="Times New Roman" w:hAnsi="Times New Roman" w:cs="Times New Roman"/>
+        </w:rPr>
+      </w:pPr>
+    </w:p>
+    <w:p>
+      <w:pPr>
+        <w:spacing w:after="0"/>
+        <w:rPr>
+          <w:rFonts w:ascii="Times New Roman" w:hAnsi="Times New Roman" w:cs="Times New Roman"/>
+        </w:rPr>
+      </w:pPr>
+      <w:r>
+        <w:rPr>
+          <w:rFonts w:ascii="Times New Roman" w:hAnsi="Times New Roman" w:cs="Times New Roman"/>
+        </w:rPr>
+        <w:t>I began implementing preprocessing and pipeline components using this dataset as a reference for:</w:t>
+      </w:r>
+    </w:p>
+    <w:p>
+      <w:pPr>
+        <w:numPr>
+          <w:ilvl w:val="0"/>
+          <w:numId w:val="22"/>
+        </w:numPr>
+        <w:spacing w:after="0"/>
+        <w:rPr>
+          <w:rFonts w:ascii="Times New Roman" w:hAnsi="Times New Roman" w:cs="Times New Roman"/>
+        </w:rPr>
+      </w:pPr>
+      <w:r>
+        <w:rPr>
+          <w:rFonts w:ascii="Times New Roman" w:hAnsi="Times New Roman" w:cs="Times New Roman"/>
+        </w:rPr>
+        <w:t>image dimensions</w:t>
+      </w:r>
+    </w:p>
+    <w:p>
+      <w:pPr>
+        <w:numPr>
+          <w:ilvl w:val="0"/>
+          <w:numId w:val="22"/>
+        </w:numPr>
+        <w:spacing w:after="0"/>
+        <w:rPr>
+          <w:rFonts w:ascii="Times New Roman" w:hAnsi="Times New Roman" w:cs="Times New Roman"/>
+        </w:rPr>
+      </w:pPr>
+      <w:r>
+        <w:rPr>
+          <w:rFonts w:ascii="Times New Roman" w:hAnsi="Times New Roman" w:cs="Times New Roman"/>
+        </w:rPr>
+        <w:t>preprocessing requirements</w:t>
+      </w:r>
+    </w:p>
+    <w:p>
+      <w:pPr>
+        <w:numPr>
+          <w:ilvl w:val="0"/>
+          <w:numId w:val="22"/>
+        </w:numPr>
+        <w:spacing w:after="0"/>
+        <w:rPr>
+          <w:rFonts w:ascii="Times New Roman" w:hAnsi="Times New Roman" w:cs="Times New Roman"/>
+        </w:rPr>
+      </w:pPr>
+      <w:r>
+        <w:rPr>
+          <w:rFonts w:ascii="Times New Roman" w:hAnsi="Times New Roman" w:cs="Times New Roman"/>
+        </w:rPr>
+        <w:t>CNN architecture design</w:t>
+      </w:r>
+    </w:p>
+    <w:p>
+      <w:pPr>
+        <w:spacing w:after="0"/>
+        <w:ind w:left="360"/>
+        <w:rPr>
+          <w:rFonts w:ascii="Times New Roman" w:hAnsi="Times New Roman" w:cs="Times New Roman"/>
+        </w:rPr>
+      </w:pPr>
+    </w:p>
+    <w:p>
+      <w:pPr>
+        <w:spacing w:after="0"/>
+        <w:rPr>
+          <w:rFonts w:ascii="Times New Roman" w:hAnsi="Times New Roman" w:cs="Times New Roman"/>
+        </w:rPr>
+      </w:pPr>
+      <w:r>
+        <w:rPr>
+          <w:rFonts w:ascii="Times New Roman" w:hAnsi="Times New Roman" w:cs="Times New Roman"/>
+        </w:rPr>
+        <w:t>This allows development of the training pipeline while waiting for the current year</w:t>
+      </w:r>
+      <w:r>
+        <w:rPr>
+          <w:rFonts w:ascii="Times New Roman" w:hAnsi="Times New Roman" w:cs="Times New Roman"/>
+        </w:rPr>
+        <w:t>’</w:t>
+      </w:r>
+      <w:r>
+        <w:rPr>
+          <w:rFonts w:ascii="Times New Roman" w:hAnsi="Times New Roman" w:cs="Times New Roman"/>
+        </w:rPr>
+        <w:t>s annotated dataset.</w:t>
+      </w:r>
+    </w:p>
+    <w:p>
+      <w:pPr>
+        <w:spacing w:after="0"/>
+        <w:rPr>
+          <w:rFonts w:ascii="Times New Roman" w:hAnsi="Times New Roman" w:cs="Times New Roman"/>
+        </w:rPr>
+      </w:pPr>
+    </w:p>
+    <w:p>
+      <w:pPr>
+        <w:spacing w:after="0"/>
+        <w:rPr>
+          <w:rFonts w:ascii="Times New Roman" w:hAnsi="Times New Roman" w:cs="Times New Roman"/>
+          <w:b/>
+          <w:bCs/>
           <w:sz w:val="28"/>
           <w:szCs w:val="28"/>
         </w:rPr>
-        <w:t>2</w:t>
-      </w:r>
-      <w:r>
-        <w:rPr>
-          <w:rFonts w:ascii="Times New Roman" w:hAnsi="Times New Roman" w:cs="Times New Roman"/>
-          <w:i/>
-          <w:iCs/>
+      </w:pPr>
+      <w:r>
+        <w:rPr>
+          <w:rFonts w:ascii="Times New Roman" w:hAnsi="Times New Roman" w:cs="Times New Roman"/>
+          <w:b/>
+          <w:bCs/>
           <w:sz w:val="28"/>
           <w:szCs w:val="28"/>
         </w:rPr>
-        <w:t xml:space="preserve">: </w:t>
-      </w:r>
-      <w:r>
-        <w:rPr>
-          <w:rFonts w:ascii="Times New Roman" w:hAnsi="Times New Roman" w:cs="Times New Roman"/>
-          <w:i/>
-          <w:iCs/>
+        <w:t>Observations / Potential Dataset Concerns</w:t>
+      </w:r>
+    </w:p>
+    <w:p>
+      <w:pPr>
+        <w:spacing w:after="0"/>
+        <w:rPr>
+          <w:rFonts w:ascii="Times New Roman" w:hAnsi="Times New Roman" w:cs="Times New Roman"/>
+        </w:rPr>
+      </w:pPr>
+      <w:r>
+        <w:rPr>
+          <w:rFonts w:ascii="Times New Roman" w:hAnsi="Times New Roman" w:cs="Times New Roman"/>
+        </w:rPr>
+        <w:t xml:space="preserve">During dataset inspection, </w:t>
+      </w:r>
+      <w:r>
+        <w:rPr>
+          <w:rFonts w:ascii="Times New Roman" w:hAnsi="Times New Roman" w:cs="Times New Roman"/>
+        </w:rPr>
+        <w:t xml:space="preserve">it appears possible (based on the folder structure of last year's dataset) that </w:t>
+      </w:r>
+      <w:r>
+        <w:rPr>
+          <w:rFonts w:ascii="Times New Roman" w:hAnsi="Times New Roman" w:cs="Times New Roman"/>
+          <w:b/>
+          <w:bCs/>
+        </w:rPr>
+        <w:t>each pesticide concentration may correspond to a single plant</w:t>
+      </w:r>
+      <w:r>
+        <w:rPr>
+          <w:rFonts w:ascii="Times New Roman" w:hAnsi="Times New Roman" w:cs="Times New Roman"/>
+          <w:b/>
+          <w:bCs/>
+        </w:rPr>
+        <w:t>.</w:t>
+      </w:r>
+    </w:p>
+    <w:p>
+      <w:pPr>
+        <w:spacing w:after="0"/>
+        <w:rPr>
+          <w:rFonts w:ascii="Times New Roman" w:hAnsi="Times New Roman" w:cs="Times New Roman"/>
+        </w:rPr>
+      </w:pPr>
+    </w:p>
+    <w:p>
+      <w:pPr>
+        <w:spacing w:after="0"/>
+        <w:rPr>
+          <w:rFonts w:ascii="Times New Roman" w:hAnsi="Times New Roman" w:cs="Times New Roman"/>
+        </w:rPr>
+      </w:pPr>
+      <w:r>
+        <w:rPr>
+          <w:rFonts w:ascii="Times New Roman" w:hAnsi="Times New Roman" w:cs="Times New Roman"/>
+        </w:rPr>
+        <w:t>If the structure is:</w:t>
+      </w:r>
+    </w:p>
+    <w:p>
+      <w:pPr>
+        <w:pStyle w:val="ListParagraph"/>
+        <w:numPr>
+          <w:ilvl w:val="0"/>
+          <w:numId w:val="28"/>
+        </w:numPr>
+        <w:spacing w:after="0"/>
+        <w:rPr>
+          <w:rFonts w:ascii="Times New Roman" w:hAnsi="Times New Roman" w:cs="Times New Roman"/>
+        </w:rPr>
+      </w:pPr>
+      <w:r>
+        <w:rPr>
+          <w:rFonts w:ascii="Times New Roman" w:hAnsi="Times New Roman" w:cs="Times New Roman"/>
+        </w:rPr>
+        <w:t xml:space="preserve">Plant A </w:t>
+      </w:r>
+      <w:r>
+        <w:rPr>
+          <w:rFonts w:ascii="Times New Roman" w:hAnsi="Times New Roman" w:cs="Times New Roman"/>
+        </w:rPr>
+        <w:t>→</w:t>
+      </w:r>
+      <w:r>
+        <w:rPr>
+          <w:rFonts w:ascii="Times New Roman" w:hAnsi="Times New Roman" w:cs="Times New Roman"/>
+        </w:rPr>
+        <w:t xml:space="preserve"> 400 ppm</w:t>
+      </w:r>
+    </w:p>
+    <w:p>
+      <w:pPr>
+        <w:pStyle w:val="ListParagraph"/>
+        <w:numPr>
+          <w:ilvl w:val="0"/>
+          <w:numId w:val="28"/>
+        </w:numPr>
+        <w:spacing w:after="0"/>
+        <w:rPr>
+          <w:rFonts w:ascii="Times New Roman" w:hAnsi="Times New Roman" w:cs="Times New Roman"/>
+        </w:rPr>
+      </w:pPr>
+      <w:r>
+        <w:rPr>
+          <w:rFonts w:ascii="Times New Roman" w:hAnsi="Times New Roman" w:cs="Times New Roman"/>
+        </w:rPr>
+        <w:t xml:space="preserve">Plant B </w:t>
+      </w:r>
+      <w:r>
+        <w:rPr>
+          <w:rFonts w:ascii="Times New Roman" w:hAnsi="Times New Roman" w:cs="Times New Roman"/>
+        </w:rPr>
+        <w:t>→</w:t>
+      </w:r>
+      <w:r>
+        <w:rPr>
+          <w:rFonts w:ascii="Times New Roman" w:hAnsi="Times New Roman" w:cs="Times New Roman"/>
+        </w:rPr>
+        <w:t xml:space="preserve"> 600 ppm</w:t>
+      </w:r>
+    </w:p>
+    <w:p>
+      <w:pPr>
+        <w:pStyle w:val="ListParagraph"/>
+        <w:numPr>
+          <w:ilvl w:val="0"/>
+          <w:numId w:val="28"/>
+        </w:numPr>
+        <w:spacing w:after="0"/>
+        <w:rPr>
+          <w:rFonts w:ascii="Times New Roman" w:hAnsi="Times New Roman" w:cs="Times New Roman"/>
+        </w:rPr>
+      </w:pPr>
+      <w:r>
+        <w:rPr>
+          <w:rFonts w:ascii="Times New Roman" w:hAnsi="Times New Roman" w:cs="Times New Roman"/>
+        </w:rPr>
+        <w:t xml:space="preserve">Plant C </w:t>
+      </w:r>
+      <w:r>
+        <w:rPr>
+          <w:rFonts w:ascii="Times New Roman" w:hAnsi="Times New Roman" w:cs="Times New Roman"/>
+        </w:rPr>
+        <w:t>→</w:t>
+      </w:r>
+      <w:r>
+        <w:rPr>
+          <w:rFonts w:ascii="Times New Roman" w:hAnsi="Times New Roman" w:cs="Times New Roman"/>
+        </w:rPr>
+        <w:t xml:space="preserve"> 800 ppm</w:t>
+      </w:r>
+    </w:p>
+    <w:p>
+      <w:pPr>
+        <w:pStyle w:val="ListParagraph"/>
+        <w:numPr>
+          <w:ilvl w:val="0"/>
+          <w:numId w:val="28"/>
+        </w:numPr>
+        <w:spacing w:after="0"/>
+        <w:rPr>
+          <w:rFonts w:ascii="Times New Roman" w:hAnsi="Times New Roman" w:cs="Times New Roman"/>
+        </w:rPr>
+      </w:pPr>
+      <w:r>
+        <w:rPr>
+          <w:rFonts w:ascii="Times New Roman" w:hAnsi="Times New Roman" w:cs="Times New Roman"/>
+        </w:rPr>
+        <w:t xml:space="preserve">Plant D </w:t>
+      </w:r>
+      <w:r>
+        <w:rPr>
+          <w:rFonts w:ascii="Times New Roman" w:hAnsi="Times New Roman" w:cs="Times New Roman"/>
+        </w:rPr>
+        <w:t>→</w:t>
+      </w:r>
+      <w:r>
+        <w:rPr>
+          <w:rFonts w:ascii="Times New Roman" w:hAnsi="Times New Roman" w:cs="Times New Roman"/>
+        </w:rPr>
+        <w:t xml:space="preserve"> 1000 ppm</w:t>
+      </w:r>
+    </w:p>
+    <w:p>
+      <w:pPr>
+        <w:spacing w:after="0"/>
+        <w:rPr>
+          <w:rFonts w:ascii="Times New Roman" w:hAnsi="Times New Roman" w:cs="Times New Roman"/>
+        </w:rPr>
+      </w:pPr>
+    </w:p>
+    <w:p>
+      <w:pPr>
+        <w:spacing w:after="0"/>
+        <w:rPr>
+          <w:rFonts w:ascii="Times New Roman" w:hAnsi="Times New Roman" w:cs="Times New Roman"/>
+        </w:rPr>
+      </w:pPr>
+      <w:r>
+        <w:rPr>
+          <w:rFonts w:ascii="Times New Roman" w:hAnsi="Times New Roman" w:cs="Times New Roman"/>
+        </w:rPr>
+        <w:lastRenderedPageBreak/>
+        <w:t xml:space="preserve">then the model may risk learning </w:t>
+      </w:r>
+      <w:r>
+        <w:rPr>
+          <w:rFonts w:ascii="Times New Roman" w:hAnsi="Times New Roman" w:cs="Times New Roman"/>
+          <w:b/>
+          <w:bCs/>
+        </w:rPr>
+        <w:t>plant identity rather than pesticide level</w:t>
+      </w:r>
+      <w:r>
+        <w:rPr>
+          <w:rFonts w:ascii="Times New Roman" w:hAnsi="Times New Roman" w:cs="Times New Roman"/>
+        </w:rPr>
+        <w:t>, because images from the same plant share:</w:t>
+      </w:r>
+    </w:p>
+    <w:p>
+      <w:pPr>
+        <w:numPr>
+          <w:ilvl w:val="0"/>
+          <w:numId w:val="23"/>
+        </w:numPr>
+        <w:spacing w:after="0"/>
+        <w:rPr>
+          <w:rFonts w:ascii="Times New Roman" w:hAnsi="Times New Roman" w:cs="Times New Roman"/>
+        </w:rPr>
+      </w:pPr>
+      <w:r>
+        <w:rPr>
+          <w:rFonts w:ascii="Times New Roman" w:hAnsi="Times New Roman" w:cs="Times New Roman"/>
+        </w:rPr>
+        <w:t>leaf texture</w:t>
+      </w:r>
+    </w:p>
+    <w:p>
+      <w:pPr>
+        <w:numPr>
+          <w:ilvl w:val="0"/>
+          <w:numId w:val="23"/>
+        </w:numPr>
+        <w:spacing w:after="0"/>
+        <w:rPr>
+          <w:rFonts w:ascii="Times New Roman" w:hAnsi="Times New Roman" w:cs="Times New Roman"/>
+        </w:rPr>
+      </w:pPr>
+      <w:r>
+        <w:rPr>
+          <w:rFonts w:ascii="Times New Roman" w:hAnsi="Times New Roman" w:cs="Times New Roman"/>
+        </w:rPr>
+        <w:t>lighting conditions</w:t>
+      </w:r>
+    </w:p>
+    <w:p>
+      <w:pPr>
+        <w:numPr>
+          <w:ilvl w:val="0"/>
+          <w:numId w:val="23"/>
+        </w:numPr>
+        <w:spacing w:after="0"/>
+        <w:rPr>
+          <w:rFonts w:ascii="Times New Roman" w:hAnsi="Times New Roman" w:cs="Times New Roman"/>
+        </w:rPr>
+      </w:pPr>
+      <w:r>
+        <w:rPr>
+          <w:rFonts w:ascii="Times New Roman" w:hAnsi="Times New Roman" w:cs="Times New Roman"/>
+        </w:rPr>
+        <w:t>background context</w:t>
+      </w:r>
+    </w:p>
+    <w:p>
+      <w:pPr>
+        <w:numPr>
+          <w:ilvl w:val="0"/>
+          <w:numId w:val="23"/>
+        </w:numPr>
+        <w:spacing w:after="0"/>
+        <w:rPr>
+          <w:rFonts w:ascii="Times New Roman" w:hAnsi="Times New Roman" w:cs="Times New Roman"/>
+        </w:rPr>
+      </w:pPr>
+      <w:r>
+        <w:rPr>
+          <w:rFonts w:ascii="Times New Roman" w:hAnsi="Times New Roman" w:cs="Times New Roman"/>
+        </w:rPr>
+        <w:t>biological characteristics</w:t>
+      </w:r>
+    </w:p>
+    <w:p>
+      <w:pPr>
+        <w:spacing w:after="0"/>
+        <w:ind w:left="360"/>
+        <w:rPr>
+          <w:rFonts w:ascii="Times New Roman" w:hAnsi="Times New Roman" w:cs="Times New Roman"/>
+        </w:rPr>
+      </w:pPr>
+    </w:p>
+    <w:p>
+      <w:pPr>
+        <w:spacing w:after="0"/>
+        <w:rPr>
+          <w:rFonts w:ascii="Times New Roman" w:hAnsi="Times New Roman" w:cs="Times New Roman"/>
+        </w:rPr>
+      </w:pPr>
+      <w:r>
+        <w:rPr>
+          <w:rFonts w:ascii="Times New Roman" w:hAnsi="Times New Roman" w:cs="Times New Roman"/>
+        </w:rPr>
+        <w:t>In that scenario, classification performance could be artificially inflated if leaves from the same plant appear in both training and test sets.</w:t>
+      </w:r>
+    </w:p>
+    <w:p>
+      <w:pPr>
+        <w:spacing w:after="0"/>
+        <w:rPr>
+          <w:rFonts w:ascii="Times New Roman" w:hAnsi="Times New Roman" w:cs="Times New Roman"/>
+        </w:rPr>
+      </w:pPr>
+    </w:p>
+    <w:p>
+      <w:pPr>
+        <w:spacing w:after="0"/>
+        <w:rPr>
+          <w:rFonts w:ascii="Times New Roman" w:hAnsi="Times New Roman" w:cs="Times New Roman"/>
+        </w:rPr>
+      </w:pPr>
+      <w:r>
+        <w:rPr>
+          <w:rFonts w:ascii="Times New Roman" w:hAnsi="Times New Roman" w:cs="Times New Roman"/>
+        </w:rPr>
+        <w:t>This may limit the reliability of classification-based evaluation and may require alternative approaches such as:</w:t>
+      </w:r>
+    </w:p>
+    <w:p>
+      <w:pPr>
+        <w:numPr>
+          <w:ilvl w:val="0"/>
+          <w:numId w:val="24"/>
+        </w:numPr>
+        <w:spacing w:after="0"/>
+        <w:rPr>
+          <w:rFonts w:ascii="Times New Roman" w:hAnsi="Times New Roman" w:cs="Times New Roman"/>
+        </w:rPr>
+      </w:pPr>
+      <w:r>
+        <w:rPr>
+          <w:rFonts w:ascii="Times New Roman" w:hAnsi="Times New Roman" w:cs="Times New Roman"/>
+        </w:rPr>
+        <w:t>residue segmentation</w:t>
+      </w:r>
+    </w:p>
+    <w:p>
+      <w:pPr>
+        <w:numPr>
+          <w:ilvl w:val="0"/>
+          <w:numId w:val="24"/>
+        </w:numPr>
+        <w:spacing w:after="0"/>
+        <w:rPr>
+          <w:rFonts w:ascii="Times New Roman" w:hAnsi="Times New Roman" w:cs="Times New Roman"/>
+        </w:rPr>
+      </w:pPr>
+      <w:r>
+        <w:rPr>
+          <w:rFonts w:ascii="Times New Roman" w:hAnsi="Times New Roman" w:cs="Times New Roman"/>
+        </w:rPr>
+        <w:t>residue coverage estimation</w:t>
+      </w:r>
+    </w:p>
+    <w:p>
+      <w:pPr>
+        <w:numPr>
+          <w:ilvl w:val="0"/>
+          <w:numId w:val="24"/>
+        </w:numPr>
+        <w:spacing w:after="0"/>
+        <w:rPr>
+          <w:rFonts w:ascii="Times New Roman" w:hAnsi="Times New Roman" w:cs="Times New Roman"/>
+        </w:rPr>
+      </w:pPr>
+      <w:r>
+        <w:rPr>
+          <w:rFonts w:ascii="Times New Roman" w:hAnsi="Times New Roman" w:cs="Times New Roman"/>
+        </w:rPr>
+        <w:t>feature-based analysis</w:t>
+      </w:r>
+    </w:p>
+    <w:p>
+      <w:pPr>
+        <w:spacing w:after="0"/>
+        <w:ind w:left="360"/>
+        <w:rPr>
+          <w:rFonts w:ascii="Times New Roman" w:hAnsi="Times New Roman" w:cs="Times New Roman"/>
+        </w:rPr>
+      </w:pPr>
+    </w:p>
+    <w:p>
+      <w:pPr>
+        <w:spacing w:after="0"/>
+        <w:rPr>
+          <w:rFonts w:ascii="Times New Roman" w:hAnsi="Times New Roman" w:cs="Times New Roman"/>
+        </w:rPr>
+      </w:pPr>
+      <w:r>
+        <w:rPr>
+          <w:rFonts w:ascii="Times New Roman" w:hAnsi="Times New Roman" w:cs="Times New Roman"/>
+        </w:rPr>
+        <w:t>I plan to discuss this with the team during the upcoming meeting with Melissa.</w:t>
+      </w:r>
+    </w:p>
+    <w:p>
+      <w:pPr>
+        <w:spacing w:after="0"/>
+        <w:rPr>
+          <w:rFonts w:ascii="Times New Roman" w:hAnsi="Times New Roman" w:cs="Times New Roman"/>
+        </w:rPr>
+      </w:pPr>
+    </w:p>
+    <w:p>
+      <w:pPr>
+        <w:spacing w:after="0"/>
+        <w:rPr>
+          <w:rFonts w:ascii="Times New Roman" w:hAnsi="Times New Roman" w:cs="Times New Roman"/>
+          <w:b/>
+          <w:bCs/>
           <w:sz w:val="28"/>
           <w:szCs w:val="28"/>
         </w:rPr>
-        <w:t>3</w:t>
-      </w:r>
-      <w:r>
-        <w:rPr>
-          <w:rFonts w:ascii="Times New Roman" w:hAnsi="Times New Roman" w:cs="Times New Roman"/>
-          <w:i/>
-          <w:iCs/>
+      </w:pPr>
+      <w:r>
+        <w:rPr>
+          <w:rFonts w:ascii="Times New Roman" w:hAnsi="Times New Roman" w:cs="Times New Roman"/>
+          <w:b/>
+          <w:bCs/>
           <w:sz w:val="28"/>
           <w:szCs w:val="28"/>
         </w:rPr>
-        <w:t>/</w:t>
-      </w:r>
-      <w:r>
-        <w:rPr>
-          <w:rFonts w:ascii="Times New Roman" w:hAnsi="Times New Roman" w:cs="Times New Roman"/>
-          <w:i/>
-          <w:iCs/>
-          <w:sz w:val="28"/>
-          <w:szCs w:val="28"/>
-        </w:rPr>
-        <w:t>9</w:t>
-      </w:r>
-      <w:r>
-        <w:rPr>
-          <w:rFonts w:ascii="Times New Roman" w:hAnsi="Times New Roman" w:cs="Times New Roman"/>
-          <w:i/>
-          <w:iCs/>
-          <w:sz w:val="28"/>
-          <w:szCs w:val="28"/>
-        </w:rPr>
-        <w:t>/2026</w:t>
-      </w:r>
-    </w:p>
-    <w:p>
-      <w:pPr>
-        <w:spacing w:after="0"/>
-        <w:rPr>
-          <w:rFonts w:ascii="Times New Roman" w:hAnsi="Times New Roman" w:cs="Times New Roman"/>
-        </w:rPr>
-      </w:pPr>
-      <w:r>
+        <w:t>Plan for Next Week</w:t>
+      </w:r>
+    </w:p>
+    <w:p>
+      <w:pPr>
+        <w:numPr>
+          <w:ilvl w:val="0"/>
+          <w:numId w:val="25"/>
+        </w:numPr>
+        <w:spacing w:after="0"/>
         <w:rPr>
           <w:rFonts w:ascii="Times New Roman" w:hAnsi="Times New Roman" w:cs="Times New Roman"/>
           <w:b/>
           <w:bCs/>
         </w:rPr>
-        <w:t>Overview</w:t>
-      </w:r>
-    </w:p>
-    <w:p>
-      <w:pPr>
-        <w:spacing w:after="0"/>
-        <w:rPr>
-          <w:rFonts w:ascii="Times New Roman" w:hAnsi="Times New Roman" w:cs="Times New Roman"/>
-        </w:rPr>
-      </w:pPr>
-      <w:r>
-        <w:rPr>
-          <w:rFonts w:ascii="Times New Roman" w:hAnsi="Times New Roman" w:cs="Times New Roman"/>
-        </w:rPr>
-        <w:t>T</w:t>
-      </w:r>
-    </w:p>
-    <w:p>
-      <w:pPr>
-        <w:spacing w:before="240" w:after="0"/>
-        <w:rPr>
-          <w:rFonts w:ascii="Times New Roman" w:hAnsi="Times New Roman" w:cs="Times New Roman"/>
-        </w:rPr>
       </w:pPr>
       <w:r>
         <w:rPr>
@@ -181,7 +1689,7 @@
           <w:b/>
           <w:bCs/>
         </w:rPr>
-        <w:t xml:space="preserve">Meetings and </w:t>
+        <w:t>Run and evaluate William</w:t>
       </w:r>
       <w:r>
         <w:rPr>
@@ -189,7 +1697,7 @@
           <w:b/>
           <w:bCs/>
         </w:rPr>
-        <w:t xml:space="preserve">Technical </w:t>
+        <w:t>’</w:t>
       </w:r>
       <w:r>
         <w:rPr>
@@ -197,25 +1705,60 @@
           <w:b/>
           <w:bCs/>
         </w:rPr>
-        <w:t>Alignment</w:t>
-      </w:r>
-    </w:p>
-    <w:p>
-      <w:pPr>
-        <w:spacing w:after="0"/>
-        <w:rPr>
-          <w:rFonts w:ascii="Times New Roman" w:hAnsi="Times New Roman" w:cs="Times New Roman"/>
-        </w:rPr>
-      </w:pPr>
-      <w:r>
-        <w:rPr>
-          <w:rFonts w:ascii="Times New Roman" w:hAnsi="Times New Roman" w:cs="Times New Roman"/>
-        </w:rPr>
-        <w:t>T</w:t>
-      </w:r>
-    </w:p>
-    <w:p>
-      <w:pPr>
+        <w:t>s RF-DETR leaf detector</w:t>
+      </w:r>
+    </w:p>
+    <w:p>
+      <w:pPr>
+        <w:numPr>
+          <w:ilvl w:val="1"/>
+          <w:numId w:val="25"/>
+        </w:numPr>
+        <w:spacing w:after="0"/>
+        <w:rPr>
+          <w:rFonts w:ascii="Times New Roman" w:hAnsi="Times New Roman" w:cs="Times New Roman"/>
+        </w:rPr>
+      </w:pPr>
+      <w:r>
+        <w:rPr>
+          <w:rFonts w:ascii="Times New Roman" w:hAnsi="Times New Roman" w:cs="Times New Roman"/>
+        </w:rPr>
+        <w:t>Test qualitative performance on pesticide images</w:t>
+      </w:r>
+    </w:p>
+    <w:p>
+      <w:pPr>
+        <w:numPr>
+          <w:ilvl w:val="1"/>
+          <w:numId w:val="25"/>
+        </w:numPr>
+        <w:spacing w:after="0"/>
+        <w:rPr>
+          <w:rFonts w:ascii="Times New Roman" w:hAnsi="Times New Roman" w:cs="Times New Roman"/>
+        </w:rPr>
+      </w:pPr>
+      <w:r>
+        <w:rPr>
+          <w:rFonts w:ascii="Times New Roman" w:hAnsi="Times New Roman" w:cs="Times New Roman"/>
+        </w:rPr>
+        <w:t>Determine whether fine-tuning is necessary.</w:t>
+      </w:r>
+    </w:p>
+    <w:p>
+      <w:pPr>
+        <w:spacing w:after="0"/>
+        <w:ind w:left="1440"/>
+        <w:rPr>
+          <w:rFonts w:ascii="Times New Roman" w:hAnsi="Times New Roman" w:cs="Times New Roman"/>
+        </w:rPr>
+      </w:pPr>
+    </w:p>
+    <w:p>
+      <w:pPr>
+        <w:numPr>
+          <w:ilvl w:val="0"/>
+          <w:numId w:val="25"/>
+        </w:numPr>
         <w:spacing w:after="0"/>
         <w:rPr>
           <w:rFonts w:ascii="Times New Roman" w:hAnsi="Times New Roman" w:cs="Times New Roman"/>
@@ -223,41 +1766,206 @@
           <w:bCs/>
         </w:rPr>
       </w:pPr>
-    </w:p>
-    <w:p>
-      <w:pPr>
-        <w:spacing w:after="0"/>
+      <w:r>
         <w:rPr>
           <w:rFonts w:ascii="Times New Roman" w:hAnsi="Times New Roman" w:cs="Times New Roman"/>
           <w:b/>
           <w:bCs/>
         </w:rPr>
-      </w:pPr>
-      <w:r>
+        <w:t>Complete baseline CNN pipeline</w:t>
+      </w:r>
+    </w:p>
+    <w:p>
+      <w:pPr>
+        <w:numPr>
+          <w:ilvl w:val="1"/>
+          <w:numId w:val="25"/>
+        </w:numPr>
+        <w:spacing w:after="0"/>
+        <w:rPr>
+          <w:rFonts w:ascii="Times New Roman" w:hAnsi="Times New Roman" w:cs="Times New Roman"/>
+        </w:rPr>
+      </w:pPr>
+      <w:r>
+        <w:rPr>
+          <w:rFonts w:ascii="Times New Roman" w:hAnsi="Times New Roman" w:cs="Times New Roman"/>
+        </w:rPr>
+        <w:t>finalize preprocessing pipeline</w:t>
+      </w:r>
+    </w:p>
+    <w:p>
+      <w:pPr>
+        <w:numPr>
+          <w:ilvl w:val="1"/>
+          <w:numId w:val="25"/>
+        </w:numPr>
+        <w:spacing w:after="0"/>
+        <w:rPr>
+          <w:rFonts w:ascii="Times New Roman" w:hAnsi="Times New Roman" w:cs="Times New Roman"/>
+        </w:rPr>
+      </w:pPr>
+      <w:r>
+        <w:rPr>
+          <w:rFonts w:ascii="Times New Roman" w:hAnsi="Times New Roman" w:cs="Times New Roman"/>
+        </w:rPr>
+        <w:t>complete training and evaluation loops</w:t>
+      </w:r>
+    </w:p>
+    <w:p>
+      <w:pPr>
+        <w:numPr>
+          <w:ilvl w:val="1"/>
+          <w:numId w:val="25"/>
+        </w:numPr>
+        <w:spacing w:after="0"/>
+        <w:rPr>
+          <w:rFonts w:ascii="Times New Roman" w:hAnsi="Times New Roman" w:cs="Times New Roman"/>
+        </w:rPr>
+      </w:pPr>
+      <w:r>
+        <w:rPr>
+          <w:rFonts w:ascii="Times New Roman" w:hAnsi="Times New Roman" w:cs="Times New Roman"/>
+        </w:rPr>
+        <w:t>run initial baseline experiments.</w:t>
+      </w:r>
+    </w:p>
+    <w:p>
+      <w:pPr>
+        <w:spacing w:after="0"/>
+        <w:ind w:left="1440"/>
+        <w:rPr>
+          <w:rFonts w:ascii="Times New Roman" w:hAnsi="Times New Roman" w:cs="Times New Roman"/>
+        </w:rPr>
+      </w:pPr>
+    </w:p>
+    <w:p>
+      <w:pPr>
+        <w:numPr>
+          <w:ilvl w:val="0"/>
+          <w:numId w:val="25"/>
+        </w:numPr>
+        <w:spacing w:after="0"/>
         <w:rPr>
           <w:rFonts w:ascii="Times New Roman" w:hAnsi="Times New Roman" w:cs="Times New Roman"/>
           <w:b/>
           <w:bCs/>
         </w:rPr>
-        <w:t>Overall goal</w:t>
-      </w:r>
-    </w:p>
-    <w:p>
-      <w:pPr>
-        <w:spacing w:after="0"/>
-        <w:rPr>
-          <w:rFonts w:ascii="Times New Roman" w:hAnsi="Times New Roman" w:cs="Times New Roman"/>
-        </w:rPr>
-      </w:pPr>
-      <w:r>
-        <w:rPr>
-          <w:rFonts w:ascii="Times New Roman" w:hAnsi="Times New Roman" w:cs="Times New Roman"/>
-        </w:rPr>
-        <w:t>T</w:t>
-      </w:r>
-    </w:p>
-    <w:p>
-      <w:pPr>
+      </w:pPr>
+      <w:r>
+        <w:rPr>
+          <w:rFonts w:ascii="Times New Roman" w:hAnsi="Times New Roman" w:cs="Times New Roman"/>
+          <w:b/>
+          <w:bCs/>
+        </w:rPr>
+        <w:t>Confirm dataset structure and annotations</w:t>
+      </w:r>
+    </w:p>
+    <w:p>
+      <w:pPr>
+        <w:numPr>
+          <w:ilvl w:val="1"/>
+          <w:numId w:val="25"/>
+        </w:numPr>
+        <w:spacing w:after="0"/>
+        <w:rPr>
+          <w:rFonts w:ascii="Times New Roman" w:hAnsi="Times New Roman" w:cs="Times New Roman"/>
+        </w:rPr>
+      </w:pPr>
+      <w:r>
+        <w:rPr>
+          <w:rFonts w:ascii="Times New Roman" w:hAnsi="Times New Roman" w:cs="Times New Roman"/>
+        </w:rPr>
+        <w:t>verify whether pesticide labels are plant-level or leaf-level</w:t>
+      </w:r>
+    </w:p>
+    <w:p>
+      <w:pPr>
+        <w:numPr>
+          <w:ilvl w:val="1"/>
+          <w:numId w:val="25"/>
+        </w:numPr>
+        <w:spacing w:after="0"/>
+        <w:rPr>
+          <w:rFonts w:ascii="Times New Roman" w:hAnsi="Times New Roman" w:cs="Times New Roman"/>
+        </w:rPr>
+      </w:pPr>
+      <w:r>
+        <w:rPr>
+          <w:rFonts w:ascii="Times New Roman" w:hAnsi="Times New Roman" w:cs="Times New Roman"/>
+        </w:rPr>
+        <w:t>inspect Roboflow annotations once access is granted.</w:t>
+      </w:r>
+    </w:p>
+    <w:p>
+      <w:pPr>
+        <w:spacing w:after="0"/>
+        <w:ind w:left="1440"/>
+        <w:rPr>
+          <w:rFonts w:ascii="Times New Roman" w:hAnsi="Times New Roman" w:cs="Times New Roman"/>
+        </w:rPr>
+      </w:pPr>
+    </w:p>
+    <w:p>
+      <w:pPr>
+        <w:numPr>
+          <w:ilvl w:val="0"/>
+          <w:numId w:val="25"/>
+        </w:numPr>
+        <w:spacing w:after="0"/>
+        <w:rPr>
+          <w:rFonts w:ascii="Times New Roman" w:hAnsi="Times New Roman" w:cs="Times New Roman"/>
+          <w:b/>
+          <w:bCs/>
+        </w:rPr>
+      </w:pPr>
+      <w:r>
+        <w:rPr>
+          <w:rFonts w:ascii="Times New Roman" w:hAnsi="Times New Roman" w:cs="Times New Roman"/>
+          <w:b/>
+          <w:bCs/>
+        </w:rPr>
+        <w:t>Discuss dataset structure and experimental design with the chemistry team</w:t>
+      </w:r>
+    </w:p>
+    <w:p>
+      <w:pPr>
+        <w:numPr>
+          <w:ilvl w:val="1"/>
+          <w:numId w:val="25"/>
+        </w:numPr>
+        <w:spacing w:after="0"/>
+        <w:rPr>
+          <w:rFonts w:ascii="Times New Roman" w:hAnsi="Times New Roman" w:cs="Times New Roman"/>
+        </w:rPr>
+      </w:pPr>
+      <w:r>
+        <w:rPr>
+          <w:rFonts w:ascii="Times New Roman" w:hAnsi="Times New Roman" w:cs="Times New Roman"/>
+        </w:rPr>
+        <w:t>clarify number of plants per pesticide level</w:t>
+      </w:r>
+    </w:p>
+    <w:p>
+      <w:pPr>
+        <w:numPr>
+          <w:ilvl w:val="1"/>
+          <w:numId w:val="25"/>
+        </w:numPr>
+        <w:spacing w:after="0"/>
+        <w:rPr>
+          <w:rFonts w:ascii="Times New Roman" w:hAnsi="Times New Roman" w:cs="Times New Roman"/>
+        </w:rPr>
+      </w:pPr>
+      <w:r>
+        <w:rPr>
+          <w:rFonts w:ascii="Times New Roman" w:hAnsi="Times New Roman" w:cs="Times New Roman"/>
+        </w:rPr>
+        <w:t>determine whether additional data collection may be needed.</w:t>
+      </w:r>
+    </w:p>
+    <w:p>
+      <w:pPr>
+        <w:spacing w:after="0"/>
         <w:rPr>
           <w:rFonts w:ascii="Times New Roman" w:hAnsi="Times New Roman" w:cs="Times New Roman"/>
         </w:rPr>
@@ -880,6 +2588,155 @@
     </w:lvl>
   </w:abstractNum>
   <w:abstractNum w:abstractNumId="3" w15:restartNumberingAfterBreak="0">
+    <w:nsid w:val="1466497B"/>
+    <w:multiLevelType w:val="multilevel"/>
+    <w:tmpl w:val="92507CDE"/>
+    <w:lvl w:ilvl="0">
+      <w:start w:val="1"/>
+      <w:numFmt w:val="bullet"/>
+      <w:lvlText w:val=""/>
+      <w:lvlJc w:val="left"/>
+      <w:pPr>
+        <w:tabs>
+          <w:tab w:val="num" w:pos="720"/>
+        </w:tabs>
+        <w:ind w:left="720" w:hanging="360"/>
+      </w:pPr>
+      <w:rPr>
+        <w:rFonts w:ascii="Symbol" w:hAnsi="Symbol" w:hint="default"/>
+        <w:sz w:val="20"/>
+      </w:rPr>
+    </w:lvl>
+    <w:lvl w:ilvl="1" w:tentative="1">
+      <w:start w:val="1"/>
+      <w:numFmt w:val="bullet"/>
+      <w:lvlText w:val="o"/>
+      <w:lvlJc w:val="left"/>
+      <w:pPr>
+        <w:tabs>
+          <w:tab w:val="num" w:pos="1440"/>
+        </w:tabs>
+        <w:ind w:left="1440" w:hanging="360"/>
+      </w:pPr>
+      <w:rPr>
+        <w:rFonts w:ascii="Courier New" w:hAnsi="Courier New" w:hint="default"/>
+        <w:sz w:val="20"/>
+      </w:rPr>
+    </w:lvl>
+    <w:lvl w:ilvl="2" w:tentative="1">
+      <w:start w:val="1"/>
+      <w:numFmt w:val="bullet"/>
+      <w:lvlText w:val=""/>
+      <w:lvlJc w:val="left"/>
+      <w:pPr>
+        <w:tabs>
+          <w:tab w:val="num" w:pos="2160"/>
+        </w:tabs>
+        <w:ind w:left="2160" w:hanging="360"/>
+      </w:pPr>
+      <w:rPr>
+        <w:rFonts w:ascii="Wingdings" w:hAnsi="Wingdings" w:hint="default"/>
+        <w:sz w:val="20"/>
+      </w:rPr>
+    </w:lvl>
+    <w:lvl w:ilvl="3" w:tentative="1">
+      <w:start w:val="1"/>
+      <w:numFmt w:val="bullet"/>
+      <w:lvlText w:val=""/>
+      <w:lvlJc w:val="left"/>
+      <w:pPr>
+        <w:tabs>
+          <w:tab w:val="num" w:pos="2880"/>
+        </w:tabs>
+        <w:ind w:left="2880" w:hanging="360"/>
+      </w:pPr>
+      <w:rPr>
+        <w:rFonts w:ascii="Wingdings" w:hAnsi="Wingdings" w:hint="default"/>
+        <w:sz w:val="20"/>
+      </w:rPr>
+    </w:lvl>
+    <w:lvl w:ilvl="4" w:tentative="1">
+      <w:start w:val="1"/>
+      <w:numFmt w:val="bullet"/>
+      <w:lvlText w:val=""/>
+      <w:lvlJc w:val="left"/>
+      <w:pPr>
+        <w:tabs>
+          <w:tab w:val="num" w:pos="3600"/>
+        </w:tabs>
+        <w:ind w:left="3600" w:hanging="360"/>
+      </w:pPr>
+      <w:rPr>
+        <w:rFonts w:ascii="Wingdings" w:hAnsi="Wingdings" w:hint="default"/>
+        <w:sz w:val="20"/>
+      </w:rPr>
+    </w:lvl>
+    <w:lvl w:ilvl="5" w:tentative="1">
+      <w:start w:val="1"/>
+      <w:numFmt w:val="bullet"/>
+      <w:lvlText w:val=""/>
+      <w:lvlJc w:val="left"/>
+      <w:pPr>
+        <w:tabs>
+          <w:tab w:val="num" w:pos="4320"/>
+        </w:tabs>
+        <w:ind w:left="4320" w:hanging="360"/>
+      </w:pPr>
+      <w:rPr>
+        <w:rFonts w:ascii="Wingdings" w:hAnsi="Wingdings" w:hint="default"/>
+        <w:sz w:val="20"/>
+      </w:rPr>
+    </w:lvl>
+    <w:lvl w:ilvl="6" w:tentative="1">
+      <w:start w:val="1"/>
+      <w:numFmt w:val="bullet"/>
+      <w:lvlText w:val=""/>
+      <w:lvlJc w:val="left"/>
+      <w:pPr>
+        <w:tabs>
+          <w:tab w:val="num" w:pos="5040"/>
+        </w:tabs>
+        <w:ind w:left="5040" w:hanging="360"/>
+      </w:pPr>
+      <w:rPr>
+        <w:rFonts w:ascii="Wingdings" w:hAnsi="Wingdings" w:hint="default"/>
+        <w:sz w:val="20"/>
+      </w:rPr>
+    </w:lvl>
+    <w:lvl w:ilvl="7" w:tentative="1">
+      <w:start w:val="1"/>
+      <w:numFmt w:val="bullet"/>
+      <w:lvlText w:val=""/>
+      <w:lvlJc w:val="left"/>
+      <w:pPr>
+        <w:tabs>
+          <w:tab w:val="num" w:pos="5760"/>
+        </w:tabs>
+        <w:ind w:left="5760" w:hanging="360"/>
+      </w:pPr>
+      <w:rPr>
+        <w:rFonts w:ascii="Wingdings" w:hAnsi="Wingdings" w:hint="default"/>
+        <w:sz w:val="20"/>
+      </w:rPr>
+    </w:lvl>
+    <w:lvl w:ilvl="8" w:tentative="1">
+      <w:start w:val="1"/>
+      <w:numFmt w:val="bullet"/>
+      <w:lvlText w:val=""/>
+      <w:lvlJc w:val="left"/>
+      <w:pPr>
+        <w:tabs>
+          <w:tab w:val="num" w:pos="6480"/>
+        </w:tabs>
+        <w:ind w:left="6480" w:hanging="360"/>
+      </w:pPr>
+      <w:rPr>
+        <w:rFonts w:ascii="Wingdings" w:hAnsi="Wingdings" w:hint="default"/>
+        <w:sz w:val="20"/>
+      </w:rPr>
+    </w:lvl>
+  </w:abstractNum>
+  <w:abstractNum w:abstractNumId="4" w15:restartNumberingAfterBreak="0">
     <w:nsid w:val="16450AE8"/>
     <w:multiLevelType w:val="hybridMultilevel"/>
     <w:tmpl w:val="2158A9C8"/>
@@ -992,7 +2849,156 @@
       </w:rPr>
     </w:lvl>
   </w:abstractNum>
-  <w:abstractNum w:abstractNumId="4" w15:restartNumberingAfterBreak="0">
+  <w:abstractNum w:abstractNumId="5" w15:restartNumberingAfterBreak="0">
+    <w:nsid w:val="174442BA"/>
+    <w:multiLevelType w:val="multilevel"/>
+    <w:tmpl w:val="38BA91E8"/>
+    <w:lvl w:ilvl="0">
+      <w:start w:val="1"/>
+      <w:numFmt w:val="bullet"/>
+      <w:lvlText w:val=""/>
+      <w:lvlJc w:val="left"/>
+      <w:pPr>
+        <w:tabs>
+          <w:tab w:val="num" w:pos="720"/>
+        </w:tabs>
+        <w:ind w:left="720" w:hanging="360"/>
+      </w:pPr>
+      <w:rPr>
+        <w:rFonts w:ascii="Symbol" w:hAnsi="Symbol" w:hint="default"/>
+        <w:sz w:val="20"/>
+      </w:rPr>
+    </w:lvl>
+    <w:lvl w:ilvl="1" w:tentative="1">
+      <w:start w:val="1"/>
+      <w:numFmt w:val="bullet"/>
+      <w:lvlText w:val="o"/>
+      <w:lvlJc w:val="left"/>
+      <w:pPr>
+        <w:tabs>
+          <w:tab w:val="num" w:pos="1440"/>
+        </w:tabs>
+        <w:ind w:left="1440" w:hanging="360"/>
+      </w:pPr>
+      <w:rPr>
+        <w:rFonts w:ascii="Courier New" w:hAnsi="Courier New" w:hint="default"/>
+        <w:sz w:val="20"/>
+      </w:rPr>
+    </w:lvl>
+    <w:lvl w:ilvl="2" w:tentative="1">
+      <w:start w:val="1"/>
+      <w:numFmt w:val="bullet"/>
+      <w:lvlText w:val=""/>
+      <w:lvlJc w:val="left"/>
+      <w:pPr>
+        <w:tabs>
+          <w:tab w:val="num" w:pos="2160"/>
+        </w:tabs>
+        <w:ind w:left="2160" w:hanging="360"/>
+      </w:pPr>
+      <w:rPr>
+        <w:rFonts w:ascii="Wingdings" w:hAnsi="Wingdings" w:hint="default"/>
+        <w:sz w:val="20"/>
+      </w:rPr>
+    </w:lvl>
+    <w:lvl w:ilvl="3" w:tentative="1">
+      <w:start w:val="1"/>
+      <w:numFmt w:val="bullet"/>
+      <w:lvlText w:val=""/>
+      <w:lvlJc w:val="left"/>
+      <w:pPr>
+        <w:tabs>
+          <w:tab w:val="num" w:pos="2880"/>
+        </w:tabs>
+        <w:ind w:left="2880" w:hanging="360"/>
+      </w:pPr>
+      <w:rPr>
+        <w:rFonts w:ascii="Wingdings" w:hAnsi="Wingdings" w:hint="default"/>
+        <w:sz w:val="20"/>
+      </w:rPr>
+    </w:lvl>
+    <w:lvl w:ilvl="4" w:tentative="1">
+      <w:start w:val="1"/>
+      <w:numFmt w:val="bullet"/>
+      <w:lvlText w:val=""/>
+      <w:lvlJc w:val="left"/>
+      <w:pPr>
+        <w:tabs>
+          <w:tab w:val="num" w:pos="3600"/>
+        </w:tabs>
+        <w:ind w:left="3600" w:hanging="360"/>
+      </w:pPr>
+      <w:rPr>
+        <w:rFonts w:ascii="Wingdings" w:hAnsi="Wingdings" w:hint="default"/>
+        <w:sz w:val="20"/>
+      </w:rPr>
+    </w:lvl>
+    <w:lvl w:ilvl="5" w:tentative="1">
+      <w:start w:val="1"/>
+      <w:numFmt w:val="bullet"/>
+      <w:lvlText w:val=""/>
+      <w:lvlJc w:val="left"/>
+      <w:pPr>
+        <w:tabs>
+          <w:tab w:val="num" w:pos="4320"/>
+        </w:tabs>
+        <w:ind w:left="4320" w:hanging="360"/>
+      </w:pPr>
+      <w:rPr>
+        <w:rFonts w:ascii="Wingdings" w:hAnsi="Wingdings" w:hint="default"/>
+        <w:sz w:val="20"/>
+      </w:rPr>
+    </w:lvl>
+    <w:lvl w:ilvl="6" w:tentative="1">
+      <w:start w:val="1"/>
+      <w:numFmt w:val="bullet"/>
+      <w:lvlText w:val=""/>
+      <w:lvlJc w:val="left"/>
+      <w:pPr>
+        <w:tabs>
+          <w:tab w:val="num" w:pos="5040"/>
+        </w:tabs>
+        <w:ind w:left="5040" w:hanging="360"/>
+      </w:pPr>
+      <w:rPr>
+        <w:rFonts w:ascii="Wingdings" w:hAnsi="Wingdings" w:hint="default"/>
+        <w:sz w:val="20"/>
+      </w:rPr>
+    </w:lvl>
+    <w:lvl w:ilvl="7" w:tentative="1">
+      <w:start w:val="1"/>
+      <w:numFmt w:val="bullet"/>
+      <w:lvlText w:val=""/>
+      <w:lvlJc w:val="left"/>
+      <w:pPr>
+        <w:tabs>
+          <w:tab w:val="num" w:pos="5760"/>
+        </w:tabs>
+        <w:ind w:left="5760" w:hanging="360"/>
+      </w:pPr>
+      <w:rPr>
+        <w:rFonts w:ascii="Wingdings" w:hAnsi="Wingdings" w:hint="default"/>
+        <w:sz w:val="20"/>
+      </w:rPr>
+    </w:lvl>
+    <w:lvl w:ilvl="8" w:tentative="1">
+      <w:start w:val="1"/>
+      <w:numFmt w:val="bullet"/>
+      <w:lvlText w:val=""/>
+      <w:lvlJc w:val="left"/>
+      <w:pPr>
+        <w:tabs>
+          <w:tab w:val="num" w:pos="6480"/>
+        </w:tabs>
+        <w:ind w:left="6480" w:hanging="360"/>
+      </w:pPr>
+      <w:rPr>
+        <w:rFonts w:ascii="Wingdings" w:hAnsi="Wingdings" w:hint="default"/>
+        <w:sz w:val="20"/>
+      </w:rPr>
+    </w:lvl>
+  </w:abstractNum>
+  <w:abstractNum w:abstractNumId="6" w15:restartNumberingAfterBreak="0">
     <w:nsid w:val="1CBD33BF"/>
     <w:multiLevelType w:val="multilevel"/>
     <w:tmpl w:val="E126F9EC"/>
@@ -1141,7 +3147,7 @@
       </w:rPr>
     </w:lvl>
   </w:abstractNum>
-  <w:abstractNum w:abstractNumId="5" w15:restartNumberingAfterBreak="0">
+  <w:abstractNum w:abstractNumId="7" w15:restartNumberingAfterBreak="0">
     <w:nsid w:val="31152E24"/>
     <w:multiLevelType w:val="multilevel"/>
     <w:tmpl w:val="CBFAD0AE"/>
@@ -1290,7 +3296,7 @@
       </w:rPr>
     </w:lvl>
   </w:abstractNum>
-  <w:abstractNum w:abstractNumId="6" w15:restartNumberingAfterBreak="0">
+  <w:abstractNum w:abstractNumId="8" w15:restartNumberingAfterBreak="0">
     <w:nsid w:val="32617C2F"/>
     <w:multiLevelType w:val="hybridMultilevel"/>
     <w:tmpl w:val="2D603B5E"/>
@@ -1403,7 +3409,156 @@
       </w:rPr>
     </w:lvl>
   </w:abstractNum>
-  <w:abstractNum w:abstractNumId="7" w15:restartNumberingAfterBreak="0">
+  <w:abstractNum w:abstractNumId="9" w15:restartNumberingAfterBreak="0">
+    <w:nsid w:val="32E710C7"/>
+    <w:multiLevelType w:val="multilevel"/>
+    <w:tmpl w:val="C390E2B8"/>
+    <w:lvl w:ilvl="0">
+      <w:start w:val="1"/>
+      <w:numFmt w:val="bullet"/>
+      <w:lvlText w:val=""/>
+      <w:lvlJc w:val="left"/>
+      <w:pPr>
+        <w:tabs>
+          <w:tab w:val="num" w:pos="720"/>
+        </w:tabs>
+        <w:ind w:left="720" w:hanging="360"/>
+      </w:pPr>
+      <w:rPr>
+        <w:rFonts w:ascii="Symbol" w:hAnsi="Symbol" w:hint="default"/>
+        <w:sz w:val="20"/>
+      </w:rPr>
+    </w:lvl>
+    <w:lvl w:ilvl="1" w:tentative="1">
+      <w:start w:val="1"/>
+      <w:numFmt w:val="bullet"/>
+      <w:lvlText w:val="o"/>
+      <w:lvlJc w:val="left"/>
+      <w:pPr>
+        <w:tabs>
+          <w:tab w:val="num" w:pos="1440"/>
+        </w:tabs>
+        <w:ind w:left="1440" w:hanging="360"/>
+      </w:pPr>
+      <w:rPr>
+        <w:rFonts w:ascii="Courier New" w:hAnsi="Courier New" w:hint="default"/>
+        <w:sz w:val="20"/>
+      </w:rPr>
+    </w:lvl>
+    <w:lvl w:ilvl="2" w:tentative="1">
+      <w:start w:val="1"/>
+      <w:numFmt w:val="bullet"/>
+      <w:lvlText w:val=""/>
+      <w:lvlJc w:val="left"/>
+      <w:pPr>
+        <w:tabs>
+          <w:tab w:val="num" w:pos="2160"/>
+        </w:tabs>
+        <w:ind w:left="2160" w:hanging="360"/>
+      </w:pPr>
+      <w:rPr>
+        <w:rFonts w:ascii="Wingdings" w:hAnsi="Wingdings" w:hint="default"/>
+        <w:sz w:val="20"/>
+      </w:rPr>
+    </w:lvl>
+    <w:lvl w:ilvl="3" w:tentative="1">
+      <w:start w:val="1"/>
+      <w:numFmt w:val="bullet"/>
+      <w:lvlText w:val=""/>
+      <w:lvlJc w:val="left"/>
+      <w:pPr>
+        <w:tabs>
+          <w:tab w:val="num" w:pos="2880"/>
+        </w:tabs>
+        <w:ind w:left="2880" w:hanging="360"/>
+      </w:pPr>
+      <w:rPr>
+        <w:rFonts w:ascii="Wingdings" w:hAnsi="Wingdings" w:hint="default"/>
+        <w:sz w:val="20"/>
+      </w:rPr>
+    </w:lvl>
+    <w:lvl w:ilvl="4" w:tentative="1">
+      <w:start w:val="1"/>
+      <w:numFmt w:val="bullet"/>
+      <w:lvlText w:val=""/>
+      <w:lvlJc w:val="left"/>
+      <w:pPr>
+        <w:tabs>
+          <w:tab w:val="num" w:pos="3600"/>
+        </w:tabs>
+        <w:ind w:left="3600" w:hanging="360"/>
+      </w:pPr>
+      <w:rPr>
+        <w:rFonts w:ascii="Wingdings" w:hAnsi="Wingdings" w:hint="default"/>
+        <w:sz w:val="20"/>
+      </w:rPr>
+    </w:lvl>
+    <w:lvl w:ilvl="5" w:tentative="1">
+      <w:start w:val="1"/>
+      <w:numFmt w:val="bullet"/>
+      <w:lvlText w:val=""/>
+      <w:lvlJc w:val="left"/>
+      <w:pPr>
+        <w:tabs>
+          <w:tab w:val="num" w:pos="4320"/>
+        </w:tabs>
+        <w:ind w:left="4320" w:hanging="360"/>
+      </w:pPr>
+      <w:rPr>
+        <w:rFonts w:ascii="Wingdings" w:hAnsi="Wingdings" w:hint="default"/>
+        <w:sz w:val="20"/>
+      </w:rPr>
+    </w:lvl>
+    <w:lvl w:ilvl="6" w:tentative="1">
+      <w:start w:val="1"/>
+      <w:numFmt w:val="bullet"/>
+      <w:lvlText w:val=""/>
+      <w:lvlJc w:val="left"/>
+      <w:pPr>
+        <w:tabs>
+          <w:tab w:val="num" w:pos="5040"/>
+        </w:tabs>
+        <w:ind w:left="5040" w:hanging="360"/>
+      </w:pPr>
+      <w:rPr>
+        <w:rFonts w:ascii="Wingdings" w:hAnsi="Wingdings" w:hint="default"/>
+        <w:sz w:val="20"/>
+      </w:rPr>
+    </w:lvl>
+    <w:lvl w:ilvl="7" w:tentative="1">
+      <w:start w:val="1"/>
+      <w:numFmt w:val="bullet"/>
+      <w:lvlText w:val=""/>
+      <w:lvlJc w:val="left"/>
+      <w:pPr>
+        <w:tabs>
+          <w:tab w:val="num" w:pos="5760"/>
+        </w:tabs>
+        <w:ind w:left="5760" w:hanging="360"/>
+      </w:pPr>
+      <w:rPr>
+        <w:rFonts w:ascii="Wingdings" w:hAnsi="Wingdings" w:hint="default"/>
+        <w:sz w:val="20"/>
+      </w:rPr>
+    </w:lvl>
+    <w:lvl w:ilvl="8" w:tentative="1">
+      <w:start w:val="1"/>
+      <w:numFmt w:val="bullet"/>
+      <w:lvlText w:val=""/>
+      <w:lvlJc w:val="left"/>
+      <w:pPr>
+        <w:tabs>
+          <w:tab w:val="num" w:pos="6480"/>
+        </w:tabs>
+        <w:ind w:left="6480" w:hanging="360"/>
+      </w:pPr>
+      <w:rPr>
+        <w:rFonts w:ascii="Wingdings" w:hAnsi="Wingdings" w:hint="default"/>
+        <w:sz w:val="20"/>
+      </w:rPr>
+    </w:lvl>
+  </w:abstractNum>
+  <w:abstractNum w:abstractNumId="10" w15:restartNumberingAfterBreak="0">
     <w:nsid w:val="355719F3"/>
     <w:multiLevelType w:val="hybridMultilevel"/>
     <w:tmpl w:val="5DF4CF1A"/>
@@ -1516,7 +3671,120 @@
       </w:rPr>
     </w:lvl>
   </w:abstractNum>
-  <w:abstractNum w:abstractNumId="8" w15:restartNumberingAfterBreak="0">
+  <w:abstractNum w:abstractNumId="11" w15:restartNumberingAfterBreak="0">
+    <w:nsid w:val="37AA231D"/>
+    <w:multiLevelType w:val="hybridMultilevel"/>
+    <w:tmpl w:val="A726E186"/>
+    <w:lvl w:ilvl="0" w:tplc="E72E5580">
+      <w:start w:val="1"/>
+      <w:numFmt w:val="bullet"/>
+      <w:lvlText w:val="-"/>
+      <w:lvlJc w:val="left"/>
+      <w:pPr>
+        <w:ind w:left="720" w:hanging="360"/>
+      </w:pPr>
+      <w:rPr>
+        <w:rFonts w:ascii="Times New Roman" w:eastAsiaTheme="minorHAnsi" w:hAnsi="Times New Roman" w:cs="Times New Roman" w:hint="default"/>
+      </w:rPr>
+    </w:lvl>
+    <w:lvl w:ilvl="1" w:tplc="04090003" w:tentative="1">
+      <w:start w:val="1"/>
+      <w:numFmt w:val="bullet"/>
+      <w:lvlText w:val="o"/>
+      <w:lvlJc w:val="left"/>
+      <w:pPr>
+        <w:ind w:left="1440" w:hanging="360"/>
+      </w:pPr>
+      <w:rPr>
+        <w:rFonts w:ascii="Courier New" w:hAnsi="Courier New" w:cs="Courier New" w:hint="default"/>
+      </w:rPr>
+    </w:lvl>
+    <w:lvl w:ilvl="2" w:tplc="04090005" w:tentative="1">
+      <w:start w:val="1"/>
+      <w:numFmt w:val="bullet"/>
+      <w:lvlText w:val=""/>
+      <w:lvlJc w:val="left"/>
+      <w:pPr>
+        <w:ind w:left="2160" w:hanging="360"/>
+      </w:pPr>
+      <w:rPr>
+        <w:rFonts w:ascii="Wingdings" w:hAnsi="Wingdings" w:hint="default"/>
+      </w:rPr>
+    </w:lvl>
+    <w:lvl w:ilvl="3" w:tplc="04090001" w:tentative="1">
+      <w:start w:val="1"/>
+      <w:numFmt w:val="bullet"/>
+      <w:lvlText w:val=""/>
+      <w:lvlJc w:val="left"/>
+      <w:pPr>
+        <w:ind w:left="2880" w:hanging="360"/>
+      </w:pPr>
+      <w:rPr>
+        <w:rFonts w:ascii="Symbol" w:hAnsi="Symbol" w:hint="default"/>
+      </w:rPr>
+    </w:lvl>
+    <w:lvl w:ilvl="4" w:tplc="04090003" w:tentative="1">
+      <w:start w:val="1"/>
+      <w:numFmt w:val="bullet"/>
+      <w:lvlText w:val="o"/>
+      <w:lvlJc w:val="left"/>
+      <w:pPr>
+        <w:ind w:left="3600" w:hanging="360"/>
+      </w:pPr>
+      <w:rPr>
+        <w:rFonts w:ascii="Courier New" w:hAnsi="Courier New" w:cs="Courier New" w:hint="default"/>
+      </w:rPr>
+    </w:lvl>
+    <w:lvl w:ilvl="5" w:tplc="04090005" w:tentative="1">
+      <w:start w:val="1"/>
+      <w:numFmt w:val="bullet"/>
+      <w:lvlText w:val=""/>
+      <w:lvlJc w:val="left"/>
+      <w:pPr>
+        <w:ind w:left="4320" w:hanging="360"/>
+      </w:pPr>
+      <w:rPr>
+        <w:rFonts w:ascii="Wingdings" w:hAnsi="Wingdings" w:hint="default"/>
+      </w:rPr>
+    </w:lvl>
+    <w:lvl w:ilvl="6" w:tplc="04090001" w:tentative="1">
+      <w:start w:val="1"/>
+      <w:numFmt w:val="bullet"/>
+      <w:lvlText w:val=""/>
+      <w:lvlJc w:val="left"/>
+      <w:pPr>
+        <w:ind w:left="5040" w:hanging="360"/>
+      </w:pPr>
+      <w:rPr>
+        <w:rFonts w:ascii="Symbol" w:hAnsi="Symbol" w:hint="default"/>
+      </w:rPr>
+    </w:lvl>
+    <w:lvl w:ilvl="7" w:tplc="04090003" w:tentative="1">
+      <w:start w:val="1"/>
+      <w:numFmt w:val="bullet"/>
+      <w:lvlText w:val="o"/>
+      <w:lvlJc w:val="left"/>
+      <w:pPr>
+        <w:ind w:left="5760" w:hanging="360"/>
+      </w:pPr>
+      <w:rPr>
+        <w:rFonts w:ascii="Courier New" w:hAnsi="Courier New" w:cs="Courier New" w:hint="default"/>
+      </w:rPr>
+    </w:lvl>
+    <w:lvl w:ilvl="8" w:tplc="04090005" w:tentative="1">
+      <w:start w:val="1"/>
+      <w:numFmt w:val="bullet"/>
+      <w:lvlText w:val=""/>
+      <w:lvlJc w:val="left"/>
+      <w:pPr>
+        <w:ind w:left="6480" w:hanging="360"/>
+      </w:pPr>
+      <w:rPr>
+        <w:rFonts w:ascii="Wingdings" w:hAnsi="Wingdings" w:hint="default"/>
+      </w:rPr>
+    </w:lvl>
+  </w:abstractNum>
+  <w:abstractNum w:abstractNumId="12" w15:restartNumberingAfterBreak="0">
     <w:nsid w:val="3B020972"/>
     <w:multiLevelType w:val="hybridMultilevel"/>
     <w:tmpl w:val="15DABCC0"/>
@@ -1629,7 +3897,418 @@
       </w:rPr>
     </w:lvl>
   </w:abstractNum>
-  <w:abstractNum w:abstractNumId="9" w15:restartNumberingAfterBreak="0">
+  <w:abstractNum w:abstractNumId="13" w15:restartNumberingAfterBreak="0">
+    <w:nsid w:val="403E4AF9"/>
+    <w:multiLevelType w:val="hybridMultilevel"/>
+    <w:tmpl w:val="81AC085A"/>
+    <w:lvl w:ilvl="0" w:tplc="E72E5580">
+      <w:start w:val="1"/>
+      <w:numFmt w:val="bullet"/>
+      <w:lvlText w:val="-"/>
+      <w:lvlJc w:val="left"/>
+      <w:pPr>
+        <w:ind w:left="720" w:hanging="360"/>
+      </w:pPr>
+      <w:rPr>
+        <w:rFonts w:ascii="Times New Roman" w:eastAsiaTheme="minorHAnsi" w:hAnsi="Times New Roman" w:cs="Times New Roman" w:hint="default"/>
+      </w:rPr>
+    </w:lvl>
+    <w:lvl w:ilvl="1" w:tplc="04090003" w:tentative="1">
+      <w:start w:val="1"/>
+      <w:numFmt w:val="bullet"/>
+      <w:lvlText w:val="o"/>
+      <w:lvlJc w:val="left"/>
+      <w:pPr>
+        <w:ind w:left="1440" w:hanging="360"/>
+      </w:pPr>
+      <w:rPr>
+        <w:rFonts w:ascii="Courier New" w:hAnsi="Courier New" w:cs="Courier New" w:hint="default"/>
+      </w:rPr>
+    </w:lvl>
+    <w:lvl w:ilvl="2" w:tplc="04090005" w:tentative="1">
+      <w:start w:val="1"/>
+      <w:numFmt w:val="bullet"/>
+      <w:lvlText w:val=""/>
+      <w:lvlJc w:val="left"/>
+      <w:pPr>
+        <w:ind w:left="2160" w:hanging="360"/>
+      </w:pPr>
+      <w:rPr>
+        <w:rFonts w:ascii="Wingdings" w:hAnsi="Wingdings" w:hint="default"/>
+      </w:rPr>
+    </w:lvl>
+    <w:lvl w:ilvl="3" w:tplc="04090001" w:tentative="1">
+      <w:start w:val="1"/>
+      <w:numFmt w:val="bullet"/>
+      <w:lvlText w:val=""/>
+      <w:lvlJc w:val="left"/>
+      <w:pPr>
+        <w:ind w:left="2880" w:hanging="360"/>
+      </w:pPr>
+      <w:rPr>
+        <w:rFonts w:ascii="Symbol" w:hAnsi="Symbol" w:hint="default"/>
+      </w:rPr>
+    </w:lvl>
+    <w:lvl w:ilvl="4" w:tplc="04090003" w:tentative="1">
+      <w:start w:val="1"/>
+      <w:numFmt w:val="bullet"/>
+      <w:lvlText w:val="o"/>
+      <w:lvlJc w:val="left"/>
+      <w:pPr>
+        <w:ind w:left="3600" w:hanging="360"/>
+      </w:pPr>
+      <w:rPr>
+        <w:rFonts w:ascii="Courier New" w:hAnsi="Courier New" w:cs="Courier New" w:hint="default"/>
+      </w:rPr>
+    </w:lvl>
+    <w:lvl w:ilvl="5" w:tplc="04090005" w:tentative="1">
+      <w:start w:val="1"/>
+      <w:numFmt w:val="bullet"/>
+      <w:lvlText w:val=""/>
+      <w:lvlJc w:val="left"/>
+      <w:pPr>
+        <w:ind w:left="4320" w:hanging="360"/>
+      </w:pPr>
+      <w:rPr>
+        <w:rFonts w:ascii="Wingdings" w:hAnsi="Wingdings" w:hint="default"/>
+      </w:rPr>
+    </w:lvl>
+    <w:lvl w:ilvl="6" w:tplc="04090001" w:tentative="1">
+      <w:start w:val="1"/>
+      <w:numFmt w:val="bullet"/>
+      <w:lvlText w:val=""/>
+      <w:lvlJc w:val="left"/>
+      <w:pPr>
+        <w:ind w:left="5040" w:hanging="360"/>
+      </w:pPr>
+      <w:rPr>
+        <w:rFonts w:ascii="Symbol" w:hAnsi="Symbol" w:hint="default"/>
+      </w:rPr>
+    </w:lvl>
+    <w:lvl w:ilvl="7" w:tplc="04090003" w:tentative="1">
+      <w:start w:val="1"/>
+      <w:numFmt w:val="bullet"/>
+      <w:lvlText w:val="o"/>
+      <w:lvlJc w:val="left"/>
+      <w:pPr>
+        <w:ind w:left="5760" w:hanging="360"/>
+      </w:pPr>
+      <w:rPr>
+        <w:rFonts w:ascii="Courier New" w:hAnsi="Courier New" w:cs="Courier New" w:hint="default"/>
+      </w:rPr>
+    </w:lvl>
+    <w:lvl w:ilvl="8" w:tplc="04090005" w:tentative="1">
+      <w:start w:val="1"/>
+      <w:numFmt w:val="bullet"/>
+      <w:lvlText w:val=""/>
+      <w:lvlJc w:val="left"/>
+      <w:pPr>
+        <w:ind w:left="6480" w:hanging="360"/>
+      </w:pPr>
+      <w:rPr>
+        <w:rFonts w:ascii="Wingdings" w:hAnsi="Wingdings" w:hint="default"/>
+      </w:rPr>
+    </w:lvl>
+  </w:abstractNum>
+  <w:abstractNum w:abstractNumId="14" w15:restartNumberingAfterBreak="0">
+    <w:nsid w:val="41C0267F"/>
+    <w:multiLevelType w:val="multilevel"/>
+    <w:tmpl w:val="2E4205E4"/>
+    <w:lvl w:ilvl="0">
+      <w:start w:val="1"/>
+      <w:numFmt w:val="bullet"/>
+      <w:lvlText w:val=""/>
+      <w:lvlJc w:val="left"/>
+      <w:pPr>
+        <w:tabs>
+          <w:tab w:val="num" w:pos="720"/>
+        </w:tabs>
+        <w:ind w:left="720" w:hanging="360"/>
+      </w:pPr>
+      <w:rPr>
+        <w:rFonts w:ascii="Symbol" w:hAnsi="Symbol" w:hint="default"/>
+        <w:sz w:val="20"/>
+      </w:rPr>
+    </w:lvl>
+    <w:lvl w:ilvl="1" w:tentative="1">
+      <w:start w:val="1"/>
+      <w:numFmt w:val="bullet"/>
+      <w:lvlText w:val="o"/>
+      <w:lvlJc w:val="left"/>
+      <w:pPr>
+        <w:tabs>
+          <w:tab w:val="num" w:pos="1440"/>
+        </w:tabs>
+        <w:ind w:left="1440" w:hanging="360"/>
+      </w:pPr>
+      <w:rPr>
+        <w:rFonts w:ascii="Courier New" w:hAnsi="Courier New" w:hint="default"/>
+        <w:sz w:val="20"/>
+      </w:rPr>
+    </w:lvl>
+    <w:lvl w:ilvl="2" w:tentative="1">
+      <w:start w:val="1"/>
+      <w:numFmt w:val="bullet"/>
+      <w:lvlText w:val=""/>
+      <w:lvlJc w:val="left"/>
+      <w:pPr>
+        <w:tabs>
+          <w:tab w:val="num" w:pos="2160"/>
+        </w:tabs>
+        <w:ind w:left="2160" w:hanging="360"/>
+      </w:pPr>
+      <w:rPr>
+        <w:rFonts w:ascii="Wingdings" w:hAnsi="Wingdings" w:hint="default"/>
+        <w:sz w:val="20"/>
+      </w:rPr>
+    </w:lvl>
+    <w:lvl w:ilvl="3" w:tentative="1">
+      <w:start w:val="1"/>
+      <w:numFmt w:val="bullet"/>
+      <w:lvlText w:val=""/>
+      <w:lvlJc w:val="left"/>
+      <w:pPr>
+        <w:tabs>
+          <w:tab w:val="num" w:pos="2880"/>
+        </w:tabs>
+        <w:ind w:left="2880" w:hanging="360"/>
+      </w:pPr>
+      <w:rPr>
+        <w:rFonts w:ascii="Wingdings" w:hAnsi="Wingdings" w:hint="default"/>
+        <w:sz w:val="20"/>
+      </w:rPr>
+    </w:lvl>
+    <w:lvl w:ilvl="4" w:tentative="1">
+      <w:start w:val="1"/>
+      <w:numFmt w:val="bullet"/>
+      <w:lvlText w:val=""/>
+      <w:lvlJc w:val="left"/>
+      <w:pPr>
+        <w:tabs>
+          <w:tab w:val="num" w:pos="3600"/>
+        </w:tabs>
+        <w:ind w:left="3600" w:hanging="360"/>
+      </w:pPr>
+      <w:rPr>
+        <w:rFonts w:ascii="Wingdings" w:hAnsi="Wingdings" w:hint="default"/>
+        <w:sz w:val="20"/>
+      </w:rPr>
+    </w:lvl>
+    <w:lvl w:ilvl="5" w:tentative="1">
+      <w:start w:val="1"/>
+      <w:numFmt w:val="bullet"/>
+      <w:lvlText w:val=""/>
+      <w:lvlJc w:val="left"/>
+      <w:pPr>
+        <w:tabs>
+          <w:tab w:val="num" w:pos="4320"/>
+        </w:tabs>
+        <w:ind w:left="4320" w:hanging="360"/>
+      </w:pPr>
+      <w:rPr>
+        <w:rFonts w:ascii="Wingdings" w:hAnsi="Wingdings" w:hint="default"/>
+        <w:sz w:val="20"/>
+      </w:rPr>
+    </w:lvl>
+    <w:lvl w:ilvl="6" w:tentative="1">
+      <w:start w:val="1"/>
+      <w:numFmt w:val="bullet"/>
+      <w:lvlText w:val=""/>
+      <w:lvlJc w:val="left"/>
+      <w:pPr>
+        <w:tabs>
+          <w:tab w:val="num" w:pos="5040"/>
+        </w:tabs>
+        <w:ind w:left="5040" w:hanging="360"/>
+      </w:pPr>
+      <w:rPr>
+        <w:rFonts w:ascii="Wingdings" w:hAnsi="Wingdings" w:hint="default"/>
+        <w:sz w:val="20"/>
+      </w:rPr>
+    </w:lvl>
+    <w:lvl w:ilvl="7" w:tentative="1">
+      <w:start w:val="1"/>
+      <w:numFmt w:val="bullet"/>
+      <w:lvlText w:val=""/>
+      <w:lvlJc w:val="left"/>
+      <w:pPr>
+        <w:tabs>
+          <w:tab w:val="num" w:pos="5760"/>
+        </w:tabs>
+        <w:ind w:left="5760" w:hanging="360"/>
+      </w:pPr>
+      <w:rPr>
+        <w:rFonts w:ascii="Wingdings" w:hAnsi="Wingdings" w:hint="default"/>
+        <w:sz w:val="20"/>
+      </w:rPr>
+    </w:lvl>
+    <w:lvl w:ilvl="8" w:tentative="1">
+      <w:start w:val="1"/>
+      <w:numFmt w:val="bullet"/>
+      <w:lvlText w:val=""/>
+      <w:lvlJc w:val="left"/>
+      <w:pPr>
+        <w:tabs>
+          <w:tab w:val="num" w:pos="6480"/>
+        </w:tabs>
+        <w:ind w:left="6480" w:hanging="360"/>
+      </w:pPr>
+      <w:rPr>
+        <w:rFonts w:ascii="Wingdings" w:hAnsi="Wingdings" w:hint="default"/>
+        <w:sz w:val="20"/>
+      </w:rPr>
+    </w:lvl>
+  </w:abstractNum>
+  <w:abstractNum w:abstractNumId="15" w15:restartNumberingAfterBreak="0">
+    <w:nsid w:val="42696DD3"/>
+    <w:multiLevelType w:val="multilevel"/>
+    <w:tmpl w:val="174646A8"/>
+    <w:lvl w:ilvl="0">
+      <w:start w:val="1"/>
+      <w:numFmt w:val="bullet"/>
+      <w:lvlText w:val=""/>
+      <w:lvlJc w:val="left"/>
+      <w:pPr>
+        <w:tabs>
+          <w:tab w:val="num" w:pos="1080"/>
+        </w:tabs>
+        <w:ind w:left="1080" w:hanging="360"/>
+      </w:pPr>
+      <w:rPr>
+        <w:rFonts w:ascii="Symbol" w:hAnsi="Symbol" w:hint="default"/>
+        <w:sz w:val="20"/>
+      </w:rPr>
+    </w:lvl>
+    <w:lvl w:ilvl="1" w:tentative="1">
+      <w:start w:val="1"/>
+      <w:numFmt w:val="bullet"/>
+      <w:lvlText w:val="o"/>
+      <w:lvlJc w:val="left"/>
+      <w:pPr>
+        <w:tabs>
+          <w:tab w:val="num" w:pos="1800"/>
+        </w:tabs>
+        <w:ind w:left="1800" w:hanging="360"/>
+      </w:pPr>
+      <w:rPr>
+        <w:rFonts w:ascii="Courier New" w:hAnsi="Courier New" w:hint="default"/>
+        <w:sz w:val="20"/>
+      </w:rPr>
+    </w:lvl>
+    <w:lvl w:ilvl="2" w:tentative="1">
+      <w:start w:val="1"/>
+      <w:numFmt w:val="bullet"/>
+      <w:lvlText w:val=""/>
+      <w:lvlJc w:val="left"/>
+      <w:pPr>
+        <w:tabs>
+          <w:tab w:val="num" w:pos="2520"/>
+        </w:tabs>
+        <w:ind w:left="2520" w:hanging="360"/>
+      </w:pPr>
+      <w:rPr>
+        <w:rFonts w:ascii="Wingdings" w:hAnsi="Wingdings" w:hint="default"/>
+        <w:sz w:val="20"/>
+      </w:rPr>
+    </w:lvl>
+    <w:lvl w:ilvl="3" w:tentative="1">
+      <w:start w:val="1"/>
+      <w:numFmt w:val="bullet"/>
+      <w:lvlText w:val=""/>
+      <w:lvlJc w:val="left"/>
+      <w:pPr>
+        <w:tabs>
+          <w:tab w:val="num" w:pos="3240"/>
+        </w:tabs>
+        <w:ind w:left="3240" w:hanging="360"/>
+      </w:pPr>
+      <w:rPr>
+        <w:rFonts w:ascii="Wingdings" w:hAnsi="Wingdings" w:hint="default"/>
+        <w:sz w:val="20"/>
+      </w:rPr>
+    </w:lvl>
+    <w:lvl w:ilvl="4" w:tentative="1">
+      <w:start w:val="1"/>
+      <w:numFmt w:val="bullet"/>
+      <w:lvlText w:val=""/>
+      <w:lvlJc w:val="left"/>
+      <w:pPr>
+        <w:tabs>
+          <w:tab w:val="num" w:pos="3960"/>
+        </w:tabs>
+        <w:ind w:left="3960" w:hanging="360"/>
+      </w:pPr>
+      <w:rPr>
+        <w:rFonts w:ascii="Wingdings" w:hAnsi="Wingdings" w:hint="default"/>
+        <w:sz w:val="20"/>
+      </w:rPr>
+    </w:lvl>
+    <w:lvl w:ilvl="5" w:tentative="1">
+      <w:start w:val="1"/>
+      <w:numFmt w:val="bullet"/>
+      <w:lvlText w:val=""/>
+      <w:lvlJc w:val="left"/>
+      <w:pPr>
+        <w:tabs>
+          <w:tab w:val="num" w:pos="4680"/>
+        </w:tabs>
+        <w:ind w:left="4680" w:hanging="360"/>
+      </w:pPr>
+      <w:rPr>
+        <w:rFonts w:ascii="Wingdings" w:hAnsi="Wingdings" w:hint="default"/>
+        <w:sz w:val="20"/>
+      </w:rPr>
+    </w:lvl>
+    <w:lvl w:ilvl="6" w:tentative="1">
+      <w:start w:val="1"/>
+      <w:numFmt w:val="bullet"/>
+      <w:lvlText w:val=""/>
+      <w:lvlJc w:val="left"/>
+      <w:pPr>
+        <w:tabs>
+          <w:tab w:val="num" w:pos="5400"/>
+        </w:tabs>
+        <w:ind w:left="5400" w:hanging="360"/>
+      </w:pPr>
+      <w:rPr>
+        <w:rFonts w:ascii="Wingdings" w:hAnsi="Wingdings" w:hint="default"/>
+        <w:sz w:val="20"/>
+      </w:rPr>
+    </w:lvl>
+    <w:lvl w:ilvl="7" w:tentative="1">
+      <w:start w:val="1"/>
+      <w:numFmt w:val="bullet"/>
+      <w:lvlText w:val=""/>
+      <w:lvlJc w:val="left"/>
+      <w:pPr>
+        <w:tabs>
+          <w:tab w:val="num" w:pos="6120"/>
+        </w:tabs>
+        <w:ind w:left="6120" w:hanging="360"/>
+      </w:pPr>
+      <w:rPr>
+        <w:rFonts w:ascii="Wingdings" w:hAnsi="Wingdings" w:hint="default"/>
+        <w:sz w:val="20"/>
+      </w:rPr>
+    </w:lvl>
+    <w:lvl w:ilvl="8" w:tentative="1">
+      <w:start w:val="1"/>
+      <w:numFmt w:val="bullet"/>
+      <w:lvlText w:val=""/>
+      <w:lvlJc w:val="left"/>
+      <w:pPr>
+        <w:tabs>
+          <w:tab w:val="num" w:pos="6840"/>
+        </w:tabs>
+        <w:ind w:left="6840" w:hanging="360"/>
+      </w:pPr>
+      <w:rPr>
+        <w:rFonts w:ascii="Wingdings" w:hAnsi="Wingdings" w:hint="default"/>
+        <w:sz w:val="20"/>
+      </w:rPr>
+    </w:lvl>
+  </w:abstractNum>
+  <w:abstractNum w:abstractNumId="16" w15:restartNumberingAfterBreak="0">
     <w:nsid w:val="4E9B585C"/>
     <w:multiLevelType w:val="multilevel"/>
     <w:tmpl w:val="2A3A6A42"/>
@@ -1778,7 +4457,96 @@
       </w:rPr>
     </w:lvl>
   </w:abstractNum>
-  <w:abstractNum w:abstractNumId="10" w15:restartNumberingAfterBreak="0">
+  <w:abstractNum w:abstractNumId="17" w15:restartNumberingAfterBreak="0">
+    <w:nsid w:val="51B14519"/>
+    <w:multiLevelType w:val="hybridMultilevel"/>
+    <w:tmpl w:val="3736596C"/>
+    <w:lvl w:ilvl="0" w:tplc="0409000F">
+      <w:start w:val="1"/>
+      <w:numFmt w:val="decimal"/>
+      <w:lvlText w:val="%1."/>
+      <w:lvlJc w:val="left"/>
+      <w:pPr>
+        <w:ind w:left="720" w:hanging="360"/>
+      </w:pPr>
+      <w:rPr>
+        <w:rFonts w:hint="default"/>
+      </w:rPr>
+    </w:lvl>
+    <w:lvl w:ilvl="1" w:tplc="04090019" w:tentative="1">
+      <w:start w:val="1"/>
+      <w:numFmt w:val="lowerLetter"/>
+      <w:lvlText w:val="%2."/>
+      <w:lvlJc w:val="left"/>
+      <w:pPr>
+        <w:ind w:left="1440" w:hanging="360"/>
+      </w:pPr>
+    </w:lvl>
+    <w:lvl w:ilvl="2" w:tplc="0409001B" w:tentative="1">
+      <w:start w:val="1"/>
+      <w:numFmt w:val="lowerRoman"/>
+      <w:lvlText w:val="%3."/>
+      <w:lvlJc w:val="right"/>
+      <w:pPr>
+        <w:ind w:left="2160" w:hanging="180"/>
+      </w:pPr>
+    </w:lvl>
+    <w:lvl w:ilvl="3" w:tplc="0409000F" w:tentative="1">
+      <w:start w:val="1"/>
+      <w:numFmt w:val="decimal"/>
+      <w:lvlText w:val="%4."/>
+      <w:lvlJc w:val="left"/>
+      <w:pPr>
+        <w:ind w:left="2880" w:hanging="360"/>
+      </w:pPr>
+    </w:lvl>
+    <w:lvl w:ilvl="4" w:tplc="04090019" w:tentative="1">
+      <w:start w:val="1"/>
+      <w:numFmt w:val="lowerLetter"/>
+      <w:lvlText w:val="%5."/>
+      <w:lvlJc w:val="left"/>
+      <w:pPr>
+        <w:ind w:left="3600" w:hanging="360"/>
+      </w:pPr>
+    </w:lvl>
+    <w:lvl w:ilvl="5" w:tplc="0409001B" w:tentative="1">
+      <w:start w:val="1"/>
+      <w:numFmt w:val="lowerRoman"/>
+      <w:lvlText w:val="%6."/>
+      <w:lvlJc w:val="right"/>
+      <w:pPr>
+        <w:ind w:left="4320" w:hanging="180"/>
+      </w:pPr>
+    </w:lvl>
+    <w:lvl w:ilvl="6" w:tplc="0409000F" w:tentative="1">
+      <w:start w:val="1"/>
+      <w:numFmt w:val="decimal"/>
+      <w:lvlText w:val="%7."/>
+      <w:lvlJc w:val="left"/>
+      <w:pPr>
+        <w:ind w:left="5040" w:hanging="360"/>
+      </w:pPr>
+    </w:lvl>
+    <w:lvl w:ilvl="7" w:tplc="04090019" w:tentative="1">
+      <w:start w:val="1"/>
+      <w:numFmt w:val="lowerLetter"/>
+      <w:lvlText w:val="%8."/>
+      <w:lvlJc w:val="left"/>
+      <w:pPr>
+        <w:ind w:left="5760" w:hanging="360"/>
+      </w:pPr>
+    </w:lvl>
+    <w:lvl w:ilvl="8" w:tplc="0409001B" w:tentative="1">
+      <w:start w:val="1"/>
+      <w:numFmt w:val="lowerRoman"/>
+      <w:lvlText w:val="%9."/>
+      <w:lvlJc w:val="right"/>
+      <w:pPr>
+        <w:ind w:left="6480" w:hanging="180"/>
+      </w:pPr>
+    </w:lvl>
+  </w:abstractNum>
+  <w:abstractNum w:abstractNumId="18" w15:restartNumberingAfterBreak="0">
     <w:nsid w:val="631B53DC"/>
     <w:multiLevelType w:val="multilevel"/>
     <w:tmpl w:val="E0804226"/>
@@ -1927,7 +4695,7 @@
       </w:rPr>
     </w:lvl>
   </w:abstractNum>
-  <w:abstractNum w:abstractNumId="11" w15:restartNumberingAfterBreak="0">
+  <w:abstractNum w:abstractNumId="19" w15:restartNumberingAfterBreak="0">
     <w:nsid w:val="633D63BF"/>
     <w:multiLevelType w:val="multilevel"/>
     <w:tmpl w:val="D7F6B8AA"/>
@@ -2076,7 +4844,7 @@
       </w:rPr>
     </w:lvl>
   </w:abstractNum>
-  <w:abstractNum w:abstractNumId="12" w15:restartNumberingAfterBreak="0">
+  <w:abstractNum w:abstractNumId="20" w15:restartNumberingAfterBreak="0">
     <w:nsid w:val="691F1AA5"/>
     <w:multiLevelType w:val="hybridMultilevel"/>
     <w:tmpl w:val="E5605A6A"/>
@@ -2189,7 +4957,7 @@
       </w:rPr>
     </w:lvl>
   </w:abstractNum>
-  <w:abstractNum w:abstractNumId="13" w15:restartNumberingAfterBreak="0">
+  <w:abstractNum w:abstractNumId="21" w15:restartNumberingAfterBreak="0">
     <w:nsid w:val="6C831F2D"/>
     <w:multiLevelType w:val="hybridMultilevel"/>
     <w:tmpl w:val="65BC3C4C"/>
@@ -2302,7 +5070,7 @@
       </w:rPr>
     </w:lvl>
   </w:abstractNum>
-  <w:abstractNum w:abstractNumId="14" w15:restartNumberingAfterBreak="0">
+  <w:abstractNum w:abstractNumId="22" w15:restartNumberingAfterBreak="0">
     <w:nsid w:val="6F7708C4"/>
     <w:multiLevelType w:val="multilevel"/>
     <w:tmpl w:val="059A2FB6"/>
@@ -2451,7 +5219,7 @@
       </w:rPr>
     </w:lvl>
   </w:abstractNum>
-  <w:abstractNum w:abstractNumId="15" w15:restartNumberingAfterBreak="0">
+  <w:abstractNum w:abstractNumId="23" w15:restartNumberingAfterBreak="0">
     <w:nsid w:val="72DC3DB7"/>
     <w:multiLevelType w:val="hybridMultilevel"/>
     <w:tmpl w:val="C226A790"/>
@@ -2564,7 +5332,273 @@
       </w:rPr>
     </w:lvl>
   </w:abstractNum>
-  <w:abstractNum w:abstractNumId="16" w15:restartNumberingAfterBreak="0">
+  <w:abstractNum w:abstractNumId="24" w15:restartNumberingAfterBreak="0">
+    <w:nsid w:val="72E0507E"/>
+    <w:multiLevelType w:val="multilevel"/>
+    <w:tmpl w:val="8F48438A"/>
+    <w:lvl w:ilvl="0">
+      <w:start w:val="1"/>
+      <w:numFmt w:val="decimal"/>
+      <w:lvlText w:val="%1."/>
+      <w:lvlJc w:val="left"/>
+      <w:pPr>
+        <w:tabs>
+          <w:tab w:val="num" w:pos="720"/>
+        </w:tabs>
+        <w:ind w:left="720" w:hanging="360"/>
+      </w:pPr>
+    </w:lvl>
+    <w:lvl w:ilvl="1">
+      <w:start w:val="1"/>
+      <w:numFmt w:val="bullet"/>
+      <w:lvlText w:val="o"/>
+      <w:lvlJc w:val="left"/>
+      <w:pPr>
+        <w:tabs>
+          <w:tab w:val="num" w:pos="1440"/>
+        </w:tabs>
+        <w:ind w:left="1440" w:hanging="360"/>
+      </w:pPr>
+      <w:rPr>
+        <w:rFonts w:ascii="Courier New" w:hAnsi="Courier New" w:hint="default"/>
+        <w:sz w:val="20"/>
+      </w:rPr>
+    </w:lvl>
+    <w:lvl w:ilvl="2" w:tentative="1">
+      <w:start w:val="1"/>
+      <w:numFmt w:val="decimal"/>
+      <w:lvlText w:val="%3."/>
+      <w:lvlJc w:val="left"/>
+      <w:pPr>
+        <w:tabs>
+          <w:tab w:val="num" w:pos="2160"/>
+        </w:tabs>
+        <w:ind w:left="2160" w:hanging="360"/>
+      </w:pPr>
+    </w:lvl>
+    <w:lvl w:ilvl="3" w:tentative="1">
+      <w:start w:val="1"/>
+      <w:numFmt w:val="decimal"/>
+      <w:lvlText w:val="%4."/>
+      <w:lvlJc w:val="left"/>
+      <w:pPr>
+        <w:tabs>
+          <w:tab w:val="num" w:pos="2880"/>
+        </w:tabs>
+        <w:ind w:left="2880" w:hanging="360"/>
+      </w:pPr>
+    </w:lvl>
+    <w:lvl w:ilvl="4" w:tentative="1">
+      <w:start w:val="1"/>
+      <w:numFmt w:val="decimal"/>
+      <w:lvlText w:val="%5."/>
+      <w:lvlJc w:val="left"/>
+      <w:pPr>
+        <w:tabs>
+          <w:tab w:val="num" w:pos="3600"/>
+        </w:tabs>
+        <w:ind w:left="3600" w:hanging="360"/>
+      </w:pPr>
+    </w:lvl>
+    <w:lvl w:ilvl="5" w:tentative="1">
+      <w:start w:val="1"/>
+      <w:numFmt w:val="decimal"/>
+      <w:lvlText w:val="%6."/>
+      <w:lvlJc w:val="left"/>
+      <w:pPr>
+        <w:tabs>
+          <w:tab w:val="num" w:pos="4320"/>
+        </w:tabs>
+        <w:ind w:left="4320" w:hanging="360"/>
+      </w:pPr>
+    </w:lvl>
+    <w:lvl w:ilvl="6" w:tentative="1">
+      <w:start w:val="1"/>
+      <w:numFmt w:val="decimal"/>
+      <w:lvlText w:val="%7."/>
+      <w:lvlJc w:val="left"/>
+      <w:pPr>
+        <w:tabs>
+          <w:tab w:val="num" w:pos="5040"/>
+        </w:tabs>
+        <w:ind w:left="5040" w:hanging="360"/>
+      </w:pPr>
+    </w:lvl>
+    <w:lvl w:ilvl="7" w:tentative="1">
+      <w:start w:val="1"/>
+      <w:numFmt w:val="decimal"/>
+      <w:lvlText w:val="%8."/>
+      <w:lvlJc w:val="left"/>
+      <w:pPr>
+        <w:tabs>
+          <w:tab w:val="num" w:pos="5760"/>
+        </w:tabs>
+        <w:ind w:left="5760" w:hanging="360"/>
+      </w:pPr>
+    </w:lvl>
+    <w:lvl w:ilvl="8" w:tentative="1">
+      <w:start w:val="1"/>
+      <w:numFmt w:val="decimal"/>
+      <w:lvlText w:val="%9."/>
+      <w:lvlJc w:val="left"/>
+      <w:pPr>
+        <w:tabs>
+          <w:tab w:val="num" w:pos="6480"/>
+        </w:tabs>
+        <w:ind w:left="6480" w:hanging="360"/>
+      </w:pPr>
+    </w:lvl>
+  </w:abstractNum>
+  <w:abstractNum w:abstractNumId="25" w15:restartNumberingAfterBreak="0">
+    <w:nsid w:val="75256D29"/>
+    <w:multiLevelType w:val="multilevel"/>
+    <w:tmpl w:val="FAB80262"/>
+    <w:lvl w:ilvl="0">
+      <w:start w:val="1"/>
+      <w:numFmt w:val="bullet"/>
+      <w:lvlText w:val=""/>
+      <w:lvlJc w:val="left"/>
+      <w:pPr>
+        <w:tabs>
+          <w:tab w:val="num" w:pos="720"/>
+        </w:tabs>
+        <w:ind w:left="720" w:hanging="360"/>
+      </w:pPr>
+      <w:rPr>
+        <w:rFonts w:ascii="Symbol" w:hAnsi="Symbol" w:hint="default"/>
+        <w:sz w:val="20"/>
+      </w:rPr>
+    </w:lvl>
+    <w:lvl w:ilvl="1" w:tentative="1">
+      <w:start w:val="1"/>
+      <w:numFmt w:val="bullet"/>
+      <w:lvlText w:val="o"/>
+      <w:lvlJc w:val="left"/>
+      <w:pPr>
+        <w:tabs>
+          <w:tab w:val="num" w:pos="1440"/>
+        </w:tabs>
+        <w:ind w:left="1440" w:hanging="360"/>
+      </w:pPr>
+      <w:rPr>
+        <w:rFonts w:ascii="Courier New" w:hAnsi="Courier New" w:hint="default"/>
+        <w:sz w:val="20"/>
+      </w:rPr>
+    </w:lvl>
+    <w:lvl w:ilvl="2" w:tentative="1">
+      <w:start w:val="1"/>
+      <w:numFmt w:val="bullet"/>
+      <w:lvlText w:val=""/>
+      <w:lvlJc w:val="left"/>
+      <w:pPr>
+        <w:tabs>
+          <w:tab w:val="num" w:pos="2160"/>
+        </w:tabs>
+        <w:ind w:left="2160" w:hanging="360"/>
+      </w:pPr>
+      <w:rPr>
+        <w:rFonts w:ascii="Wingdings" w:hAnsi="Wingdings" w:hint="default"/>
+        <w:sz w:val="20"/>
+      </w:rPr>
+    </w:lvl>
+    <w:lvl w:ilvl="3" w:tentative="1">
+      <w:start w:val="1"/>
+      <w:numFmt w:val="bullet"/>
+      <w:lvlText w:val=""/>
+      <w:lvlJc w:val="left"/>
+      <w:pPr>
+        <w:tabs>
+          <w:tab w:val="num" w:pos="2880"/>
+        </w:tabs>
+        <w:ind w:left="2880" w:hanging="360"/>
+      </w:pPr>
+      <w:rPr>
+        <w:rFonts w:ascii="Wingdings" w:hAnsi="Wingdings" w:hint="default"/>
+        <w:sz w:val="20"/>
+      </w:rPr>
+    </w:lvl>
+    <w:lvl w:ilvl="4" w:tentative="1">
+      <w:start w:val="1"/>
+      <w:numFmt w:val="bullet"/>
+      <w:lvlText w:val=""/>
+      <w:lvlJc w:val="left"/>
+      <w:pPr>
+        <w:tabs>
+          <w:tab w:val="num" w:pos="3600"/>
+        </w:tabs>
+        <w:ind w:left="3600" w:hanging="360"/>
+      </w:pPr>
+      <w:rPr>
+        <w:rFonts w:ascii="Wingdings" w:hAnsi="Wingdings" w:hint="default"/>
+        <w:sz w:val="20"/>
+      </w:rPr>
+    </w:lvl>
+    <w:lvl w:ilvl="5" w:tentative="1">
+      <w:start w:val="1"/>
+      <w:numFmt w:val="bullet"/>
+      <w:lvlText w:val=""/>
+      <w:lvlJc w:val="left"/>
+      <w:pPr>
+        <w:tabs>
+          <w:tab w:val="num" w:pos="4320"/>
+        </w:tabs>
+        <w:ind w:left="4320" w:hanging="360"/>
+      </w:pPr>
+      <w:rPr>
+        <w:rFonts w:ascii="Wingdings" w:hAnsi="Wingdings" w:hint="default"/>
+        <w:sz w:val="20"/>
+      </w:rPr>
+    </w:lvl>
+    <w:lvl w:ilvl="6" w:tentative="1">
+      <w:start w:val="1"/>
+      <w:numFmt w:val="bullet"/>
+      <w:lvlText w:val=""/>
+      <w:lvlJc w:val="left"/>
+      <w:pPr>
+        <w:tabs>
+          <w:tab w:val="num" w:pos="5040"/>
+        </w:tabs>
+        <w:ind w:left="5040" w:hanging="360"/>
+      </w:pPr>
+      <w:rPr>
+        <w:rFonts w:ascii="Wingdings" w:hAnsi="Wingdings" w:hint="default"/>
+        <w:sz w:val="20"/>
+      </w:rPr>
+    </w:lvl>
+    <w:lvl w:ilvl="7" w:tentative="1">
+      <w:start w:val="1"/>
+      <w:numFmt w:val="bullet"/>
+      <w:lvlText w:val=""/>
+      <w:lvlJc w:val="left"/>
+      <w:pPr>
+        <w:tabs>
+          <w:tab w:val="num" w:pos="5760"/>
+        </w:tabs>
+        <w:ind w:left="5760" w:hanging="360"/>
+      </w:pPr>
+      <w:rPr>
+        <w:rFonts w:ascii="Wingdings" w:hAnsi="Wingdings" w:hint="default"/>
+        <w:sz w:val="20"/>
+      </w:rPr>
+    </w:lvl>
+    <w:lvl w:ilvl="8" w:tentative="1">
+      <w:start w:val="1"/>
+      <w:numFmt w:val="bullet"/>
+      <w:lvlText w:val=""/>
+      <w:lvlJc w:val="left"/>
+      <w:pPr>
+        <w:tabs>
+          <w:tab w:val="num" w:pos="6480"/>
+        </w:tabs>
+        <w:ind w:left="6480" w:hanging="360"/>
+      </w:pPr>
+      <w:rPr>
+        <w:rFonts w:ascii="Wingdings" w:hAnsi="Wingdings" w:hint="default"/>
+        <w:sz w:val="20"/>
+      </w:rPr>
+    </w:lvl>
+  </w:abstractNum>
+  <w:abstractNum w:abstractNumId="26" w15:restartNumberingAfterBreak="0">
     <w:nsid w:val="7B9732A9"/>
     <w:multiLevelType w:val="hybridMultilevel"/>
     <w:tmpl w:val="7A56C3CA"/>
@@ -2677,7 +5711,7 @@
       </w:rPr>
     </w:lvl>
   </w:abstractNum>
-  <w:abstractNum w:abstractNumId="17" w15:restartNumberingAfterBreak="0">
+  <w:abstractNum w:abstractNumId="27" w15:restartNumberingAfterBreak="0">
     <w:nsid w:val="7C103850"/>
     <w:multiLevelType w:val="multilevel"/>
     <w:tmpl w:val="215E8E6E"/>
@@ -2827,58 +5861,88 @@
     </w:lvl>
   </w:abstractNum>
   <w:num w:numId="1" w16cid:durableId="284046430">
-    <w:abstractNumId w:val="10"/>
+    <w:abstractNumId w:val="18"/>
   </w:num>
   <w:num w:numId="2" w16cid:durableId="609626163">
-    <w:abstractNumId w:val="5"/>
+    <w:abstractNumId w:val="7"/>
   </w:num>
   <w:num w:numId="3" w16cid:durableId="1944679054">
-    <w:abstractNumId w:val="14"/>
+    <w:abstractNumId w:val="22"/>
   </w:num>
   <w:num w:numId="4" w16cid:durableId="1381631686">
-    <w:abstractNumId w:val="17"/>
+    <w:abstractNumId w:val="27"/>
   </w:num>
   <w:num w:numId="5" w16cid:durableId="2011714154">
-    <w:abstractNumId w:val="9"/>
+    <w:abstractNumId w:val="16"/>
   </w:num>
   <w:num w:numId="6" w16cid:durableId="30960402">
     <w:abstractNumId w:val="0"/>
   </w:num>
   <w:num w:numId="7" w16cid:durableId="771821519">
-    <w:abstractNumId w:val="7"/>
+    <w:abstractNumId w:val="10"/>
   </w:num>
   <w:num w:numId="8" w16cid:durableId="1479807125">
     <w:abstractNumId w:val="2"/>
   </w:num>
   <w:num w:numId="9" w16cid:durableId="2032339886">
-    <w:abstractNumId w:val="11"/>
+    <w:abstractNumId w:val="19"/>
   </w:num>
   <w:num w:numId="10" w16cid:durableId="1113356337">
-    <w:abstractNumId w:val="4"/>
+    <w:abstractNumId w:val="6"/>
   </w:num>
   <w:num w:numId="11" w16cid:durableId="722024924">
-    <w:abstractNumId w:val="16"/>
+    <w:abstractNumId w:val="26"/>
   </w:num>
   <w:num w:numId="12" w16cid:durableId="2088114732">
-    <w:abstractNumId w:val="6"/>
+    <w:abstractNumId w:val="8"/>
   </w:num>
   <w:num w:numId="13" w16cid:durableId="1654289970">
-    <w:abstractNumId w:val="8"/>
+    <w:abstractNumId w:val="12"/>
   </w:num>
   <w:num w:numId="14" w16cid:durableId="1358507059">
-    <w:abstractNumId w:val="13"/>
+    <w:abstractNumId w:val="21"/>
   </w:num>
   <w:num w:numId="15" w16cid:durableId="2086683399">
-    <w:abstractNumId w:val="3"/>
+    <w:abstractNumId w:val="4"/>
   </w:num>
   <w:num w:numId="16" w16cid:durableId="1917737059">
     <w:abstractNumId w:val="1"/>
   </w:num>
   <w:num w:numId="17" w16cid:durableId="265235788">
-    <w:abstractNumId w:val="12"/>
+    <w:abstractNumId w:val="20"/>
   </w:num>
   <w:num w:numId="18" w16cid:durableId="2065713446">
+    <w:abstractNumId w:val="23"/>
+  </w:num>
+  <w:num w:numId="19" w16cid:durableId="310981505">
     <w:abstractNumId w:val="15"/>
+  </w:num>
+  <w:num w:numId="20" w16cid:durableId="1820000867">
+    <w:abstractNumId w:val="5"/>
+  </w:num>
+  <w:num w:numId="21" w16cid:durableId="859510586">
+    <w:abstractNumId w:val="14"/>
+  </w:num>
+  <w:num w:numId="22" w16cid:durableId="920681256">
+    <w:abstractNumId w:val="9"/>
+  </w:num>
+  <w:num w:numId="23" w16cid:durableId="1698695321">
+    <w:abstractNumId w:val="25"/>
+  </w:num>
+  <w:num w:numId="24" w16cid:durableId="1496415289">
+    <w:abstractNumId w:val="3"/>
+  </w:num>
+  <w:num w:numId="25" w16cid:durableId="1137450678">
+    <w:abstractNumId w:val="24"/>
+  </w:num>
+  <w:num w:numId="26" w16cid:durableId="223296044">
+    <w:abstractNumId w:val="13"/>
+  </w:num>
+  <w:num w:numId="27" w16cid:durableId="147285826">
+    <w:abstractNumId w:val="17"/>
+  </w:num>
+  <w:num w:numId="28" w16cid:durableId="1168517096">
+    <w:abstractNumId w:val="11"/>
   </w:num>
 </w:numbering>
 </file>
@@ -3487,7 +6551,6 @@
   <w:style w:type="character" w:default="1" w:styleId="DefaultParagraphFont">
     <w:name w:val="Default Paragraph Font"/>
     <w:uiPriority w:val="1"/>
-    <w:semiHidden/>
     <w:unhideWhenUsed/>
   </w:style>
   <w:style w:type="table" w:default="1" w:styleId="TableNormal">

</xml_diff>